<commit_message>
Performed simplified power analyses across both methods. For Aim 1, generated a table testing seven different correlations across three alphas. For Aim 2, chose one alpha based on Aim 1 and tested differing amyloid positive sample sizes across three amyloid negative correlations. Edited report and started presentation slides
</commit_message>
<xml_diff>
--- a/Project2/Reports/Project2_Final_Analysis_Plan.docx
+++ b/Project2/Reports/Project2_Final_Analysis_Plan.docx
@@ -18,6 +18,7 @@
       <w:bookmarkStart w:id="3" w:name="_Toc223592408"/>
       <w:bookmarkStart w:id="4" w:name="_Toc223624407"/>
       <w:bookmarkStart w:id="5" w:name="_Toc223687122"/>
+      <w:bookmarkStart w:id="6" w:name="_Toc224400995"/>
       <w:r>
         <w:rPr>
           <w:b/>
@@ -56,6 +57,7 @@
       <w:bookmarkEnd w:id="3"/>
       <w:bookmarkEnd w:id="4"/>
       <w:bookmarkEnd w:id="5"/>
+      <w:bookmarkEnd w:id="6"/>
     </w:p>
     <w:p>
       <w:pPr>
@@ -67,12 +69,13 @@
           <w:color w:val="000000" w:themeColor="text1"/>
         </w:rPr>
       </w:pPr>
-      <w:bookmarkStart w:id="6" w:name="_Toc221895314"/>
-      <w:bookmarkStart w:id="7" w:name="_Toc221895379"/>
-      <w:bookmarkStart w:id="8" w:name="_Toc222223984"/>
-      <w:bookmarkStart w:id="9" w:name="_Toc223592409"/>
-      <w:bookmarkStart w:id="10" w:name="_Toc223624408"/>
-      <w:bookmarkStart w:id="11" w:name="_Toc223687123"/>
+      <w:bookmarkStart w:id="7" w:name="_Toc221895314"/>
+      <w:bookmarkStart w:id="8" w:name="_Toc221895379"/>
+      <w:bookmarkStart w:id="9" w:name="_Toc222223984"/>
+      <w:bookmarkStart w:id="10" w:name="_Toc223592409"/>
+      <w:bookmarkStart w:id="11" w:name="_Toc223624408"/>
+      <w:bookmarkStart w:id="12" w:name="_Toc223687123"/>
+      <w:bookmarkStart w:id="13" w:name="_Toc224400996"/>
       <w:r>
         <w:rPr>
           <w:b/>
@@ -81,12 +84,13 @@
         </w:rPr>
         <w:t>Data Analysis Plan</w:t>
       </w:r>
-      <w:bookmarkEnd w:id="6"/>
       <w:bookmarkEnd w:id="7"/>
       <w:bookmarkEnd w:id="8"/>
       <w:bookmarkEnd w:id="9"/>
       <w:bookmarkEnd w:id="10"/>
       <w:bookmarkEnd w:id="11"/>
+      <w:bookmarkEnd w:id="12"/>
+      <w:bookmarkEnd w:id="13"/>
     </w:p>
     <w:p/>
     <w:p>
@@ -145,96 +149,97 @@
             <w:pStyle w:val="TOCHeading"/>
             <w:rPr>
               <w:noProof/>
+              <w:sz w:val="24"/>
+              <w:szCs w:val="24"/>
             </w:rPr>
           </w:pPr>
           <w:r>
+            <w:rPr>
+              <w:sz w:val="24"/>
+              <w:szCs w:val="24"/>
+            </w:rPr>
             <w:t>Table of Contents</w:t>
           </w:r>
           <w:r>
             <w:rPr>
               <w:b w:val="0"/>
               <w:bCs w:val="0"/>
+              <w:sz w:val="24"/>
+              <w:szCs w:val="24"/>
             </w:rPr>
             <w:fldChar w:fldCharType="begin"/>
           </w:r>
           <w:r>
+            <w:rPr>
+              <w:sz w:val="24"/>
+              <w:szCs w:val="24"/>
+            </w:rPr>
             <w:instrText xml:space="preserve"> TOC \o "1-3" \h \z \u </w:instrText>
           </w:r>
           <w:r>
             <w:rPr>
               <w:b w:val="0"/>
               <w:bCs w:val="0"/>
+              <w:sz w:val="24"/>
+              <w:szCs w:val="24"/>
             </w:rPr>
             <w:fldChar w:fldCharType="separate"/>
           </w:r>
+          <w:hyperlink w:anchor="_Toc224400996" w:history="1"/>
         </w:p>
         <w:p>
           <w:pPr>
-            <w:pStyle w:val="TOC2"/>
-            <w:tabs>
-              <w:tab w:val="right" w:leader="dot" w:pos="9350"/>
-            </w:tabs>
+            <w:pStyle w:val="TOC3"/>
             <w:rPr>
               <w:rFonts w:eastAsiaTheme="minorEastAsia"/>
-              <w:b w:val="0"/>
-              <w:bCs w:val="0"/>
-              <w:noProof/>
               <w:sz w:val="24"/>
               <w:szCs w:val="24"/>
             </w:rPr>
           </w:pPr>
-          <w:hyperlink w:anchor="_Toc223687124" w:history="1">
+          <w:hyperlink w:anchor="_Toc224400997" w:history="1">
             <w:r>
               <w:rPr>
                 <w:rStyle w:val="Hyperlink"/>
-                <w:noProof/>
               </w:rPr>
-              <w:t>Aim 1:</w:t>
+              <w:t>Data Management and Cleaning</w:t>
             </w:r>
             <w:r>
               <w:rPr>
-                <w:noProof/>
                 <w:webHidden/>
               </w:rPr>
               <w:tab/>
             </w:r>
             <w:r>
               <w:rPr>
-                <w:noProof/>
                 <w:webHidden/>
               </w:rPr>
               <w:fldChar w:fldCharType="begin"/>
             </w:r>
             <w:r>
               <w:rPr>
-                <w:noProof/>
                 <w:webHidden/>
               </w:rPr>
-              <w:instrText xml:space="preserve"> PAGEREF _Toc223687124 \h </w:instrText>
+              <w:instrText xml:space="preserve"> PAGEREF _Toc224400997 \h </w:instrText>
             </w:r>
             <w:r>
               <w:rPr>
-                <w:noProof/>
                 <w:webHidden/>
               </w:rPr>
             </w:r>
             <w:r>
               <w:rPr>
-                <w:noProof/>
                 <w:webHidden/>
               </w:rPr>
               <w:fldChar w:fldCharType="separate"/>
             </w:r>
             <w:r>
               <w:rPr>
-                <w:noProof/>
                 <w:webHidden/>
               </w:rPr>
               <w:t>2</w:t>
             </w:r>
             <w:r>
               <w:rPr>
-                <w:noProof/>
                 <w:webHidden/>
               </w:rPr>
               <w:fldChar w:fldCharType="end"/>
@@ -243,71 +248,57 @@
         </w:p>
         <w:p>
           <w:pPr>
-            <w:pStyle w:val="TOC2"/>
-            <w:tabs>
-              <w:tab w:val="right" w:leader="dot" w:pos="9350"/>
-            </w:tabs>
+            <w:pStyle w:val="TOC3"/>
             <w:rPr>
               <w:rFonts w:eastAsiaTheme="minorEastAsia"/>
-              <w:b w:val="0"/>
-              <w:bCs w:val="0"/>
-              <w:noProof/>
               <w:sz w:val="24"/>
               <w:szCs w:val="24"/>
             </w:rPr>
           </w:pPr>
-          <w:hyperlink w:anchor="_Toc223687125" w:history="1">
+          <w:hyperlink w:anchor="_Toc224400998" w:history="1">
             <w:r>
               <w:rPr>
                 <w:rStyle w:val="Hyperlink"/>
-                <w:noProof/>
               </w:rPr>
-              <w:t>Aim 2:</w:t>
+              <w:t>General Analytical Framework</w:t>
             </w:r>
             <w:r>
               <w:rPr>
-                <w:noProof/>
                 <w:webHidden/>
               </w:rPr>
               <w:tab/>
             </w:r>
             <w:r>
               <w:rPr>
-                <w:noProof/>
                 <w:webHidden/>
               </w:rPr>
               <w:fldChar w:fldCharType="begin"/>
             </w:r>
             <w:r>
               <w:rPr>
-                <w:noProof/>
                 <w:webHidden/>
               </w:rPr>
-              <w:instrText xml:space="preserve"> PAGEREF _Toc223687125 \h </w:instrText>
+              <w:instrText xml:space="preserve"> PAGEREF _Toc224400998 \h </w:instrText>
             </w:r>
             <w:r>
               <w:rPr>
-                <w:noProof/>
                 <w:webHidden/>
               </w:rPr>
             </w:r>
             <w:r>
               <w:rPr>
-                <w:noProof/>
                 <w:webHidden/>
               </w:rPr>
               <w:fldChar w:fldCharType="separate"/>
             </w:r>
             <w:r>
               <w:rPr>
-                <w:noProof/>
                 <w:webHidden/>
               </w:rPr>
-              <w:t>3</w:t>
+              <w:t>2</w:t>
             </w:r>
             <w:r>
               <w:rPr>
-                <w:noProof/>
                 <w:webHidden/>
               </w:rPr>
               <w:fldChar w:fldCharType="end"/>
@@ -316,71 +307,116 @@
         </w:p>
         <w:p>
           <w:pPr>
-            <w:pStyle w:val="TOC2"/>
-            <w:tabs>
-              <w:tab w:val="right" w:leader="dot" w:pos="9350"/>
-            </w:tabs>
+            <w:pStyle w:val="TOC3"/>
             <w:rPr>
               <w:rFonts w:eastAsiaTheme="minorEastAsia"/>
-              <w:b w:val="0"/>
-              <w:bCs w:val="0"/>
-              <w:noProof/>
               <w:sz w:val="24"/>
               <w:szCs w:val="24"/>
             </w:rPr>
           </w:pPr>
-          <w:hyperlink w:anchor="_Toc223687126" w:history="1">
+          <w:hyperlink w:anchor="_Toc224400999" w:history="1">
             <w:r>
               <w:rPr>
                 <w:rStyle w:val="Hyperlink"/>
-                <w:noProof/>
               </w:rPr>
-              <w:t>Power Analysis:</w:t>
+              <w:t>Details of the Analyses</w:t>
             </w:r>
             <w:r>
               <w:rPr>
-                <w:noProof/>
                 <w:webHidden/>
               </w:rPr>
               <w:tab/>
             </w:r>
             <w:r>
               <w:rPr>
-                <w:noProof/>
                 <w:webHidden/>
               </w:rPr>
               <w:fldChar w:fldCharType="begin"/>
             </w:r>
             <w:r>
               <w:rPr>
-                <w:noProof/>
                 <w:webHidden/>
               </w:rPr>
-              <w:instrText xml:space="preserve"> PAGEREF _Toc223687126 \h </w:instrText>
+              <w:instrText xml:space="preserve"> PAGEREF _Toc224400999 \h </w:instrText>
             </w:r>
             <w:r>
               <w:rPr>
-                <w:noProof/>
                 <w:webHidden/>
               </w:rPr>
             </w:r>
             <w:r>
               <w:rPr>
-                <w:noProof/>
                 <w:webHidden/>
               </w:rPr>
               <w:fldChar w:fldCharType="separate"/>
             </w:r>
             <w:r>
               <w:rPr>
-                <w:noProof/>
                 <w:webHidden/>
               </w:rPr>
-              <w:t>3</w:t>
+              <w:t>2</w:t>
             </w:r>
             <w:r>
               <w:rPr>
-                <w:noProof/>
+                <w:webHidden/>
+              </w:rPr>
+              <w:fldChar w:fldCharType="end"/>
+            </w:r>
+          </w:hyperlink>
+        </w:p>
+        <w:p>
+          <w:pPr>
+            <w:pStyle w:val="TOC3"/>
+            <w:rPr>
+              <w:rFonts w:eastAsiaTheme="minorEastAsia"/>
+              <w:sz w:val="24"/>
+              <w:szCs w:val="24"/>
+            </w:rPr>
+          </w:pPr>
+          <w:hyperlink w:anchor="_Toc224401000" w:history="1">
+            <w:r>
+              <w:rPr>
+                <w:rStyle w:val="Hyperlink"/>
+              </w:rPr>
+              <w:t>Power Analysis</w:t>
+            </w:r>
+            <w:r>
+              <w:rPr>
+                <w:webHidden/>
+              </w:rPr>
+              <w:tab/>
+            </w:r>
+            <w:r>
+              <w:rPr>
+                <w:webHidden/>
+              </w:rPr>
+              <w:fldChar w:fldCharType="begin"/>
+            </w:r>
+            <w:r>
+              <w:rPr>
+                <w:webHidden/>
+              </w:rPr>
+              <w:instrText xml:space="preserve"> PAGEREF _Toc224401000 \h </w:instrText>
+            </w:r>
+            <w:r>
+              <w:rPr>
+                <w:webHidden/>
+              </w:rPr>
+            </w:r>
+            <w:r>
+              <w:rPr>
+                <w:webHidden/>
+              </w:rPr>
+              <w:fldChar w:fldCharType="separate"/>
+            </w:r>
+            <w:r>
+              <w:rPr>
+                <w:webHidden/>
+              </w:rPr>
+              <w:t>4</w:t>
+            </w:r>
+            <w:r>
+              <w:rPr>
                 <w:webHidden/>
               </w:rPr>
               <w:fldChar w:fldCharType="end"/>
@@ -499,1252 +535,573 @@
         </w:rPr>
       </w:pPr>
     </w:p>
-    <w:p>
-      <w:pPr>
-        <w:pStyle w:val="Heading2"/>
-      </w:pPr>
-      <w:bookmarkStart w:id="12" w:name="_Toc223592410"/>
-      <w:bookmarkStart w:id="13" w:name="_Toc223624409"/>
-      <w:bookmarkStart w:id="14" w:name="_Toc223687124"/>
-      <w:r>
-        <w:lastRenderedPageBreak/>
-        <w:t>Aim 1:</w:t>
-      </w:r>
-      <w:bookmarkEnd w:id="12"/>
-      <w:bookmarkEnd w:id="13"/>
-      <w:bookmarkEnd w:id="14"/>
-    </w:p>
-    <w:p>
-      <w:pPr>
-        <w:pStyle w:val="Heading4"/>
-      </w:pPr>
-      <w:r>
-        <w:t>Hypotheses</w:t>
-      </w:r>
-    </w:p>
-    <w:p>
-      <w:r>
-        <w:rPr>
-          <w:b/>
-          <w:bCs/>
-        </w:rPr>
-        <w:t>1a</w:t>
-      </w:r>
-      <w:r>
-        <w:t xml:space="preserve">: </w:t>
-      </w:r>
-      <w:r>
-        <w:t>Higher baseline peripheral inflammatory marker levels (</w:t>
-      </w:r>
-      <w:r>
-        <w:t>cytokines</w:t>
-      </w:r>
-      <w:r>
-        <w:t xml:space="preserve">: IL-6, TNF-α, </w:t>
-      </w:r>
-      <w:r>
-        <w:t>chemokines:</w:t>
-      </w:r>
-      <w:r>
-        <w:t xml:space="preserve">MCP-1, Eotaxin-1) will be associated with greater 1-year decline in </w:t>
-      </w:r>
-      <w:r>
-        <w:t>cognitive</w:t>
-      </w:r>
-      <w:r>
-        <w:t xml:space="preserve"> outcomes and AD-signature mean cortical thickness.</w:t>
-      </w:r>
-    </w:p>
-    <w:p>
-      <w:r>
-        <w:rPr>
-          <w:b/>
-          <w:bCs/>
-        </w:rPr>
-        <w:t>1b</w:t>
-      </w:r>
-      <w:r>
-        <w:t xml:space="preserve">: </w:t>
-      </w:r>
-      <w:r>
-        <w:t xml:space="preserve">Greater 1-year increases in peripheral inflammatory markers will be associated with greater 1-year declines in the same cognitive and </w:t>
-      </w:r>
-      <w:r>
-        <w:t>cortical</w:t>
-      </w:r>
-      <w:r>
-        <w:t xml:space="preserve"> outcomes.</w:t>
-      </w:r>
-    </w:p>
-    <w:p>
-      <w:pPr>
-        <w:pStyle w:val="Heading4"/>
-      </w:pPr>
-      <w:r>
-        <w:t>Outcomes</w:t>
-      </w:r>
-    </w:p>
-    <w:p>
-      <w:r>
-        <w:t xml:space="preserve">Outcomes will be defined as </w:t>
-      </w:r>
-      <w:r>
-        <w:t>changes from baseline to year-1</w:t>
-      </w:r>
-      <w:r>
-        <w:t>, where positive values indicate worsening cognition or cortical thinning and negative values indicate potential improvement</w:t>
-      </w:r>
-      <w:r>
-        <w:t>:</w:t>
-      </w:r>
-    </w:p>
-    <w:p>
-      <w:pPr>
-        <w:pStyle w:val="ListParagraph"/>
-        <w:numPr>
-          <w:ilvl w:val="0"/>
-          <w:numId w:val="7"/>
-        </w:numPr>
-      </w:pPr>
-      <w:r>
-        <w:t>Memory</w:t>
-      </w:r>
-      <w:r>
-        <w:t xml:space="preserve"> (cognitive measures)</w:t>
-      </w:r>
-      <w:r>
-        <w:t>: CVLT</w:t>
-      </w:r>
-      <w:r>
-        <w:t>, Benson Figure</w:t>
-      </w:r>
-      <w:r>
-        <w:t xml:space="preserve"> (Recall/Recognition)</w:t>
-      </w:r>
-      <w:r>
-        <w:t>, MST</w:t>
-      </w:r>
-      <w:r>
-        <w:t xml:space="preserve"> (Pattern Separation), and </w:t>
-      </w:r>
-      <w:r>
-        <w:t>Store Recall</w:t>
-      </w:r>
-      <w:r>
-        <w:t xml:space="preserve"> (Long-term Consolidation)</w:t>
-      </w:r>
-    </w:p>
-    <w:p>
-      <w:pPr>
-        <w:pStyle w:val="ListParagraph"/>
-        <w:numPr>
-          <w:ilvl w:val="0"/>
-          <w:numId w:val="7"/>
-        </w:numPr>
-      </w:pPr>
-      <w:r>
-        <w:t xml:space="preserve">Bain Structure (grey matter) </w:t>
-      </w:r>
-      <w:r>
-        <w:t xml:space="preserve">: </w:t>
-      </w:r>
-      <w:r>
-        <w:t xml:space="preserve">AD-signature mean cortical thickness </w:t>
-      </w:r>
-      <w:r>
-        <w:t xml:space="preserve">analyzed </w:t>
-      </w:r>
-      <w:r>
-        <w:t xml:space="preserve">from </w:t>
-      </w:r>
-      <w:r>
-        <w:t xml:space="preserve">T1 MPRAGE structural MR images using </w:t>
-      </w:r>
-      <w:proofErr w:type="spellStart"/>
-      <w:r>
-        <w:t>FreeSurfer</w:t>
-      </w:r>
-      <w:proofErr w:type="spellEnd"/>
-      <w:r>
-        <w:t>.</w:t>
-      </w:r>
-    </w:p>
-    <w:p>
-      <w:pPr>
-        <w:pStyle w:val="Heading4"/>
-        <w:spacing w:before="0" w:after="0"/>
-      </w:pPr>
-      <w:r>
-        <w:t>Predictors</w:t>
-      </w:r>
-    </w:p>
-    <w:p>
-      <w:r>
-        <w:t xml:space="preserve">Peripheral inflammation markers measured in </w:t>
-      </w:r>
-      <w:r>
-        <w:t xml:space="preserve">circulating </w:t>
-      </w:r>
-      <w:r>
-        <w:t>plasma</w:t>
-      </w:r>
-      <w:r>
-        <w:t xml:space="preserve"> </w:t>
-      </w:r>
-      <w:r>
-        <w:t xml:space="preserve">at </w:t>
-      </w:r>
-      <w:r>
-        <w:t>baseline and year-1</w:t>
-      </w:r>
-      <w:r>
-        <w:t xml:space="preserve">. </w:t>
-      </w:r>
-      <w:r>
-        <w:t xml:space="preserve">Primary </w:t>
-      </w:r>
-      <w:r>
-        <w:t>markers</w:t>
-      </w:r>
-      <w:r>
-        <w:t xml:space="preserve"> include cytokines (IL-6, TNF-α) and chemokines (MCP-1, Eotaxin-1)</w:t>
-      </w:r>
-      <w:r>
-        <w:t>.</w:t>
-      </w:r>
-    </w:p>
-    <w:p>
-      <w:pPr>
-        <w:pStyle w:val="Heading4"/>
-        <w:contextualSpacing/>
-      </w:pPr>
-    </w:p>
-    <w:p>
-      <w:pPr>
-        <w:pStyle w:val="Heading4"/>
-        <w:contextualSpacing/>
-      </w:pPr>
-      <w:r>
-        <w:t>Modelling strategy</w:t>
-      </w:r>
-    </w:p>
-    <w:p>
-      <w:pPr>
-        <w:contextualSpacing/>
-      </w:pPr>
-      <w:r>
-        <w:t>For hypothesis 1a,</w:t>
-      </w:r>
-      <w:r>
-        <w:t xml:space="preserve"> we will regress outcome changes from baseline to year-1 on baseline inflammatory marker levels. For hypothesis 1b, we will regress outcome changes from baseline to year-1 on the change in inflammatory marker levels.</w:t>
-      </w:r>
-    </w:p>
-    <w:p>
-      <w:pPr>
-        <w:contextualSpacing/>
-      </w:pPr>
-    </w:p>
-    <w:p>
-      <w:pPr>
-        <w:contextualSpacing/>
-      </w:pPr>
-    </w:p>
-    <w:p>
-      <w:pPr>
-        <w:contextualSpacing/>
-      </w:pPr>
-    </w:p>
-    <w:p>
-      <w:pPr>
-        <w:contextualSpacing/>
-      </w:pPr>
-    </w:p>
-    <w:p>
-      <w:pPr>
-        <w:contextualSpacing/>
-      </w:pPr>
-      <w:r>
-        <w:t xml:space="preserve">for </w:t>
-      </w:r>
-      <w:r>
-        <w:t xml:space="preserve">each outcome (memory </w:t>
-      </w:r>
-      <w:r>
-        <w:t>and</w:t>
-      </w:r>
-      <w:r>
-        <w:t xml:space="preserve"> cortical thickness), we will </w:t>
-      </w:r>
-      <w:r>
-        <w:t xml:space="preserve">fit a linear regression </w:t>
-      </w:r>
-      <w:r>
-        <w:t xml:space="preserve">model </w:t>
-      </w:r>
-      <w:r>
-        <w:t>using</w:t>
-      </w:r>
-      <w:r>
-        <w:t xml:space="preserve"> </w:t>
-      </w:r>
-      <w:r>
-        <w:t>year 1</w:t>
-      </w:r>
-      <w:r>
-        <w:t xml:space="preserve"> value</w:t>
-      </w:r>
-      <w:r>
-        <w:t>s</w:t>
-      </w:r>
-      <w:r>
-        <w:t xml:space="preserve"> as a function of the baseline outcome</w:t>
-      </w:r>
-      <w:r>
-        <w:t>s</w:t>
-      </w:r>
-      <w:r>
-        <w:t>, baseline inflammatory marker</w:t>
-      </w:r>
-      <w:r>
-        <w:t>s</w:t>
-      </w:r>
-      <w:r>
-        <w:t xml:space="preserve"> and covariates</w:t>
-      </w:r>
-      <w:r>
-        <w:t xml:space="preserve">. </w:t>
-      </w:r>
-      <w:r>
-        <w:t>Similarly, f</w:t>
-      </w:r>
-      <w:r>
-        <w:t xml:space="preserve">or hypothesis 1b, </w:t>
-      </w:r>
-      <w:r>
-        <w:t>we</w:t>
-      </w:r>
-      <w:r>
-        <w:t xml:space="preserve"> will </w:t>
-      </w:r>
-      <w:r>
-        <w:t xml:space="preserve">fit a linear </w:t>
-      </w:r>
-      <w:r>
-        <w:t xml:space="preserve">model </w:t>
-      </w:r>
-      <w:r>
-        <w:t xml:space="preserve">with </w:t>
-      </w:r>
-      <w:r>
-        <w:t xml:space="preserve">1-year </w:t>
-      </w:r>
-      <w:r>
-        <w:t xml:space="preserve">outcomes </w:t>
-      </w:r>
-      <w:r>
-        <w:t xml:space="preserve">as a function of baseline </w:t>
-      </w:r>
-      <w:r>
-        <w:t>outcomes</w:t>
-      </w:r>
-      <w:r>
-        <w:t>, baseline inflammation, and year-1 inflammatio</w:t>
-      </w:r>
-      <w:r>
-        <w:t>n</w:t>
-      </w:r>
-      <w:r>
-        <w:t>. The coefficient for year-1 inflammation</w:t>
-      </w:r>
-      <w:r>
-        <w:t xml:space="preserve"> will</w:t>
-      </w:r>
-      <w:r>
-        <w:t xml:space="preserve"> </w:t>
-      </w:r>
-      <w:r>
-        <w:t>estimate</w:t>
-      </w:r>
-      <w:r>
-        <w:t xml:space="preserve"> the association between increases in inflammatory markers over the follow-up period and </w:t>
-      </w:r>
-      <w:r>
-        <w:t>outcomes</w:t>
-      </w:r>
-      <w:r>
-        <w:t>, conditional on baseline levels.</w:t>
-      </w:r>
-    </w:p>
-    <w:p>
-      <w:pPr>
-        <w:contextualSpacing/>
-      </w:pPr>
-    </w:p>
-    <w:p>
-      <w:r>
-        <w:lastRenderedPageBreak/>
-        <w:t xml:space="preserve">All models will adjust for age and sex. Based on pilot data, </w:t>
-      </w:r>
-      <w:r>
-        <w:t xml:space="preserve">we </w:t>
-      </w:r>
-      <w:r>
-        <w:t xml:space="preserve">will additionally adjust for baseline </w:t>
-      </w:r>
-      <w:r>
-        <w:t>C</w:t>
-      </w:r>
-      <w:r>
-        <w:t xml:space="preserve">linical </w:t>
-      </w:r>
-      <w:r>
-        <w:t>D</w:t>
-      </w:r>
-      <w:r>
-        <w:t xml:space="preserve">ementia </w:t>
-      </w:r>
-      <w:r>
-        <w:t>R</w:t>
-      </w:r>
-      <w:r>
-        <w:t>ating</w:t>
-      </w:r>
-      <w:r>
-        <w:t xml:space="preserve"> (CDR) and APOE</w:t>
-      </w:r>
-      <w:r>
-        <w:t xml:space="preserve"> genotype</w:t>
-      </w:r>
-      <w:r>
-        <w:t>. To address known associations between inflammation and cardiovascular risk and immune-health history (correlations among these health measures)</w:t>
-      </w:r>
-      <w:r>
-        <w:t>, we will perform m</w:t>
-      </w:r>
-      <w:r>
-        <w:t xml:space="preserve">ulticollinearity </w:t>
-      </w:r>
-      <w:r>
-        <w:t xml:space="preserve">diagnostics </w:t>
-      </w:r>
-      <w:r>
-        <w:t>(e.g., VIF)</w:t>
-      </w:r>
-      <w:r>
-        <w:t xml:space="preserve"> to indicate the severity of the correlation. If sever</w:t>
-      </w:r>
-      <w:r>
-        <w:t>e</w:t>
-      </w:r>
-      <w:r>
-        <w:t xml:space="preserve">, </w:t>
-      </w:r>
-      <w:r>
-        <w:t xml:space="preserve">we will </w:t>
-      </w:r>
-      <w:r>
-        <w:t>perform</w:t>
-      </w:r>
-      <w:r>
-        <w:t xml:space="preserve"> sensitivity </w:t>
-      </w:r>
-      <w:r>
-        <w:t>analysis to understand how the inflammation effect changes with and without these variables.</w:t>
-      </w:r>
-      <w:r>
-        <w:t xml:space="preserve"> If sensitivity determines lack of robustness, centering the</w:t>
-      </w:r>
-      <w:r>
-        <w:t xml:space="preserve"> predictor</w:t>
-      </w:r>
-      <w:r>
-        <w:t xml:space="preserve"> continuous variables</w:t>
-      </w:r>
-      <w:r>
-        <w:t xml:space="preserve"> to stabilize estimates</w:t>
-      </w:r>
-      <w:r>
-        <w:t xml:space="preserve"> may be an option at the expense of interpretability.</w:t>
-      </w:r>
-    </w:p>
-    <w:p/>
-    <w:p>
-      <w:pPr>
-        <w:pStyle w:val="Heading2"/>
-      </w:pPr>
-      <w:bookmarkStart w:id="15" w:name="_Toc223624410"/>
-      <w:bookmarkStart w:id="16" w:name="_Toc223687125"/>
-      <w:r>
-        <w:t>Aim 2:</w:t>
-      </w:r>
-      <w:bookmarkEnd w:id="15"/>
-      <w:bookmarkEnd w:id="16"/>
-    </w:p>
-    <w:p>
-      <w:pPr>
-        <w:pStyle w:val="Heading4"/>
-      </w:pPr>
-      <w:r>
-        <w:t>Hypotheses</w:t>
-      </w:r>
-    </w:p>
-    <w:p>
-      <w:r>
-        <w:rPr>
-          <w:b/>
-          <w:bCs/>
-        </w:rPr>
-        <w:t>2a</w:t>
-      </w:r>
-      <w:r>
-        <w:t xml:space="preserve">: </w:t>
-      </w:r>
-      <w:r>
-        <w:t xml:space="preserve"> </w:t>
-      </w:r>
-      <w:r>
-        <w:t>A</w:t>
-      </w:r>
-      <w:r>
-        <w:t xml:space="preserve">myloid </w:t>
-      </w:r>
-      <w:r>
-        <w:t>deposition (accumulation of abnormal proteins)</w:t>
-      </w:r>
-      <w:r>
-        <w:t xml:space="preserve"> will modify the association between peripheral inflammation and 1-year </w:t>
-      </w:r>
-      <w:r>
-        <w:t>change</w:t>
-      </w:r>
-      <w:r>
-        <w:t xml:space="preserve"> in memory and AD-signature cortical thickness</w:t>
-      </w:r>
-      <w:r>
-        <w:t>. S</w:t>
-      </w:r>
-      <w:r>
-        <w:t xml:space="preserve">pecifically, </w:t>
-      </w:r>
-      <w:r>
-        <w:t xml:space="preserve">patients with </w:t>
-      </w:r>
-      <w:r>
-        <w:t>greater</w:t>
-      </w:r>
-      <w:r>
-        <w:t xml:space="preserve"> </w:t>
-      </w:r>
-      <w:r>
-        <w:t xml:space="preserve">amyloid </w:t>
-      </w:r>
-      <w:r>
-        <w:t>accumulation and elevated</w:t>
-      </w:r>
-      <w:r>
-        <w:t xml:space="preserve"> inflammation will </w:t>
-      </w:r>
-      <w:r>
-        <w:t xml:space="preserve">show the greatest decline in memory and </w:t>
-      </w:r>
-      <w:r>
-        <w:t>AD-signature cortical thickness</w:t>
-      </w:r>
-      <w:r>
-        <w:t>.</w:t>
-      </w:r>
-    </w:p>
-    <w:p>
-      <w:pPr>
-        <w:pStyle w:val="Heading4"/>
-        <w:spacing w:line="240" w:lineRule="auto"/>
-      </w:pPr>
-      <w:r>
-        <w:t>Outcomes</w:t>
-      </w:r>
-    </w:p>
-    <w:p>
-      <w:pPr>
-        <w:spacing w:line="240" w:lineRule="auto"/>
-      </w:pPr>
-      <w:r>
-        <w:t>S</w:t>
-      </w:r>
-      <w:r>
-        <w:t xml:space="preserve">ame as Aim </w:t>
-      </w:r>
-      <w:r>
-        <w:t>1. Change between baseline and year-1 in cognitive outcomes and AD-signature cortical thickness.</w:t>
-      </w:r>
-    </w:p>
-    <w:p>
-      <w:pPr>
-        <w:pStyle w:val="Heading4"/>
-        <w:spacing w:line="240" w:lineRule="auto"/>
-      </w:pPr>
-      <w:r>
-        <w:lastRenderedPageBreak/>
-        <w:t>Predictors</w:t>
-      </w:r>
-    </w:p>
-    <w:p>
-      <w:pPr>
-        <w:pStyle w:val="Heading4"/>
-        <w:spacing w:before="0" w:after="120" w:line="240" w:lineRule="auto"/>
-        <w:rPr>
-          <w:rFonts w:eastAsiaTheme="minorHAnsi" w:cstheme="minorBidi"/>
-          <w:i w:val="0"/>
-          <w:iCs w:val="0"/>
-          <w:color w:val="auto"/>
-        </w:rPr>
-      </w:pPr>
-      <w:r>
-        <w:rPr>
-          <w:rFonts w:eastAsiaTheme="minorHAnsi" w:cstheme="minorBidi"/>
-          <w:i w:val="0"/>
-          <w:iCs w:val="0"/>
-          <w:color w:val="auto"/>
-        </w:rPr>
-        <w:t xml:space="preserve">Amyloid </w:t>
-      </w:r>
-      <w:r>
-        <w:rPr>
-          <w:rFonts w:eastAsiaTheme="minorHAnsi" w:cstheme="minorBidi"/>
-          <w:i w:val="0"/>
-          <w:iCs w:val="0"/>
-          <w:color w:val="auto"/>
-        </w:rPr>
-        <w:t>deposition</w:t>
-      </w:r>
-      <w:r>
-        <w:rPr>
-          <w:rFonts w:eastAsiaTheme="minorHAnsi" w:cstheme="minorBidi"/>
-          <w:i w:val="0"/>
-          <w:iCs w:val="0"/>
-          <w:color w:val="auto"/>
-        </w:rPr>
-        <w:t>, inflammation (baseline and year-1), and the inflammation</w:t>
-      </w:r>
-      <w:r>
-        <w:rPr>
-          <w:rFonts w:eastAsiaTheme="minorHAnsi" w:cstheme="minorBidi"/>
-          <w:i w:val="0"/>
-          <w:iCs w:val="0"/>
-          <w:color w:val="auto"/>
-        </w:rPr>
-        <w:t xml:space="preserve"> x </w:t>
-      </w:r>
-      <w:r>
-        <w:rPr>
-          <w:rFonts w:eastAsiaTheme="minorHAnsi" w:cstheme="minorBidi"/>
-          <w:i w:val="0"/>
-          <w:iCs w:val="0"/>
-          <w:color w:val="auto"/>
-        </w:rPr>
-        <w:t>amyloid</w:t>
-      </w:r>
-      <w:r>
-        <w:rPr>
-          <w:rFonts w:eastAsiaTheme="minorHAnsi" w:cstheme="minorBidi"/>
-          <w:i w:val="0"/>
-          <w:iCs w:val="0"/>
-          <w:color w:val="auto"/>
-        </w:rPr>
-        <w:t xml:space="preserve"> interaction.</w:t>
-      </w:r>
-    </w:p>
-    <w:p>
-      <w:pPr>
-        <w:pStyle w:val="Heading4"/>
-        <w:spacing w:after="120" w:line="240" w:lineRule="auto"/>
-      </w:pPr>
-      <w:r>
-        <w:t>Modelling strategy</w:t>
-      </w:r>
-    </w:p>
-    <w:p>
-      <w:pPr>
-        <w:pStyle w:val="Heading4"/>
-        <w:spacing w:line="240" w:lineRule="auto"/>
-        <w:rPr>
-          <w:rFonts w:eastAsiaTheme="minorHAnsi" w:cstheme="minorBidi"/>
-          <w:i w:val="0"/>
-          <w:iCs w:val="0"/>
-          <w:color w:val="auto"/>
-        </w:rPr>
-      </w:pPr>
-      <w:r>
-        <w:rPr>
-          <w:rFonts w:eastAsiaTheme="minorHAnsi" w:cstheme="minorBidi"/>
-          <w:i w:val="0"/>
-          <w:iCs w:val="0"/>
-          <w:color w:val="auto"/>
-        </w:rPr>
-        <w:t>Aim 2 will build directly on</w:t>
-      </w:r>
-      <w:r>
-        <w:rPr>
-          <w:rFonts w:eastAsiaTheme="minorHAnsi" w:cstheme="minorBidi"/>
-          <w:i w:val="0"/>
-          <w:iCs w:val="0"/>
-          <w:color w:val="auto"/>
-        </w:rPr>
-        <w:t xml:space="preserve"> Aim 1 models by </w:t>
-      </w:r>
-      <w:r>
-        <w:rPr>
-          <w:rFonts w:eastAsiaTheme="minorHAnsi" w:cstheme="minorBidi"/>
-          <w:i w:val="0"/>
-          <w:iCs w:val="0"/>
-          <w:color w:val="auto"/>
-        </w:rPr>
-        <w:t>including</w:t>
-      </w:r>
-      <w:r>
-        <w:rPr>
-          <w:rFonts w:eastAsiaTheme="minorHAnsi" w:cstheme="minorBidi"/>
-          <w:i w:val="0"/>
-          <w:iCs w:val="0"/>
-          <w:color w:val="auto"/>
-        </w:rPr>
-        <w:t xml:space="preserve"> the amyloid deposition and </w:t>
-      </w:r>
-      <w:r>
-        <w:rPr>
-          <w:rFonts w:eastAsiaTheme="minorHAnsi" w:cstheme="minorBidi"/>
-          <w:i w:val="0"/>
-          <w:iCs w:val="0"/>
-          <w:color w:val="auto"/>
-        </w:rPr>
-        <w:t xml:space="preserve"> interaction terms. The primary test for Aim 2 will focus on the interaction term, which evaluations whether amyloid deposition modifies the relationship between inflammation and </w:t>
-      </w:r>
-      <w:r>
-        <w:rPr>
-          <w:rFonts w:eastAsiaTheme="minorHAnsi" w:cstheme="minorBidi"/>
-          <w:i w:val="0"/>
-          <w:iCs w:val="0"/>
-          <w:color w:val="auto"/>
-        </w:rPr>
-        <w:t>cognitive and AD-signature cortical thickness</w:t>
-      </w:r>
-      <w:r>
-        <w:rPr>
-          <w:rFonts w:eastAsiaTheme="minorHAnsi" w:cstheme="minorBidi"/>
-          <w:i w:val="0"/>
-          <w:iCs w:val="0"/>
-          <w:color w:val="auto"/>
-        </w:rPr>
-        <w:t xml:space="preserve"> outcomes</w:t>
-      </w:r>
-      <w:r>
-        <w:rPr>
-          <w:rFonts w:eastAsiaTheme="minorHAnsi" w:cstheme="minorBidi"/>
-          <w:i w:val="0"/>
-          <w:iCs w:val="0"/>
-          <w:color w:val="auto"/>
-        </w:rPr>
-        <w:t>.</w:t>
-      </w:r>
-    </w:p>
-    <w:p>
-      <w:pPr>
-        <w:pStyle w:val="Heading4"/>
-        <w:spacing w:line="240" w:lineRule="auto"/>
-        <w:rPr>
-          <w:rFonts w:eastAsiaTheme="minorHAnsi" w:cstheme="minorBidi"/>
-          <w:i w:val="0"/>
-          <w:iCs w:val="0"/>
-          <w:color w:val="auto"/>
-        </w:rPr>
-      </w:pPr>
-    </w:p>
-    <w:p>
-      <w:pPr>
-        <w:pStyle w:val="Heading4"/>
-        <w:spacing w:line="240" w:lineRule="auto"/>
-        <w:rPr>
-          <w:rFonts w:eastAsiaTheme="minorHAnsi" w:cstheme="minorBidi"/>
-          <w:i w:val="0"/>
-          <w:iCs w:val="0"/>
-          <w:color w:val="auto"/>
-        </w:rPr>
-      </w:pPr>
-      <w:r>
-        <w:rPr>
-          <w:rFonts w:eastAsiaTheme="minorHAnsi" w:cstheme="minorBidi"/>
-          <w:i w:val="0"/>
-          <w:iCs w:val="0"/>
-          <w:color w:val="auto"/>
-        </w:rPr>
-        <w:t>focusing on the interaction effect between peripheral inflammation and amyloid deposition.</w:t>
-      </w:r>
-    </w:p>
-    <w:p>
-      <w:pPr>
-        <w:pStyle w:val="Heading2"/>
-      </w:pPr>
-      <w:bookmarkStart w:id="17" w:name="_Toc223687126"/>
-      <w:r>
-        <w:t>Power Analysis:</w:t>
-      </w:r>
-      <w:bookmarkEnd w:id="17"/>
-    </w:p>
-    <w:p>
-      <w:pPr>
-        <w:pStyle w:val="Heading4"/>
-        <w:spacing w:after="0" w:line="240" w:lineRule="auto"/>
-        <w:rPr>
-          <w:rFonts w:eastAsiaTheme="minorHAnsi" w:cstheme="minorBidi"/>
-          <w:i w:val="0"/>
-          <w:iCs w:val="0"/>
-          <w:color w:val="auto"/>
-        </w:rPr>
-      </w:pPr>
-      <w:r>
-        <w:rPr>
-          <w:rFonts w:eastAsiaTheme="minorHAnsi" w:cstheme="minorBidi"/>
-          <w:i w:val="0"/>
-          <w:iCs w:val="0"/>
-          <w:color w:val="auto"/>
-        </w:rPr>
-        <w:t xml:space="preserve">Power calculations will evaluate whether </w:t>
-      </w:r>
-      <w:r>
-        <w:rPr>
-          <w:rFonts w:eastAsiaTheme="minorHAnsi" w:cstheme="minorBidi"/>
-          <w:i w:val="0"/>
-          <w:iCs w:val="0"/>
-          <w:color w:val="auto"/>
-        </w:rPr>
-        <w:t xml:space="preserve">the proposed sample size of 137 aMCI and 55 healthy </w:t>
-      </w:r>
-      <w:r>
-        <w:rPr>
-          <w:rFonts w:eastAsiaTheme="minorHAnsi" w:cstheme="minorBidi"/>
-          <w:i w:val="0"/>
-          <w:iCs w:val="0"/>
-          <w:color w:val="auto"/>
-        </w:rPr>
-        <w:t xml:space="preserve">controls </w:t>
-      </w:r>
-      <w:r>
-        <w:rPr>
-          <w:rFonts w:eastAsiaTheme="minorHAnsi" w:cstheme="minorBidi"/>
-          <w:i w:val="0"/>
-          <w:iCs w:val="0"/>
-          <w:color w:val="auto"/>
-        </w:rPr>
-        <w:t>will provide</w:t>
-      </w:r>
-      <w:r>
-        <w:rPr>
-          <w:rFonts w:eastAsiaTheme="minorHAnsi" w:cstheme="minorBidi"/>
-          <w:i w:val="0"/>
-          <w:iCs w:val="0"/>
-          <w:color w:val="auto"/>
-        </w:rPr>
-        <w:t xml:space="preserve"> adequate power to detect the hypothesized associations in Aims 1–2. Because both predictors (cytokine/chemokine levels) and outcomes (memory and cortical thickness) are continuous, simplified power analyses will approximate the planned covariate-adjusted linear regression models using correlation-based methods</w:t>
-      </w:r>
-      <w:r>
-        <w:rPr>
-          <w:rFonts w:eastAsiaTheme="minorHAnsi" w:cstheme="minorBidi"/>
-          <w:i w:val="0"/>
-          <w:iCs w:val="0"/>
-          <w:color w:val="auto"/>
-        </w:rPr>
-        <w:t xml:space="preserve"> </w:t>
-      </w:r>
-      <w:r>
-        <w:rPr>
-          <w:rFonts w:eastAsiaTheme="minorHAnsi" w:cstheme="minorBidi"/>
-          <w:i w:val="0"/>
-          <w:iCs w:val="0"/>
-          <w:color w:val="auto"/>
-        </w:rPr>
-        <w:t xml:space="preserve"> </w:t>
-      </w:r>
-      <w:r>
-        <w:rPr>
-          <w:rFonts w:eastAsiaTheme="minorHAnsi" w:cstheme="minorBidi"/>
-          <w:i w:val="0"/>
-          <w:iCs w:val="0"/>
-          <w:color w:val="auto"/>
-        </w:rPr>
-        <w:t>`</w:t>
-      </w:r>
-      <w:r>
-        <w:rPr>
-          <w:rFonts w:eastAsiaTheme="minorHAnsi" w:cstheme="minorBidi"/>
-          <w:i w:val="0"/>
-          <w:iCs w:val="0"/>
-          <w:color w:val="auto"/>
-        </w:rPr>
-        <w:t>corr.1samp</w:t>
-      </w:r>
-      <w:r>
-        <w:rPr>
-          <w:rFonts w:eastAsiaTheme="minorHAnsi" w:cstheme="minorBidi"/>
-          <w:i w:val="0"/>
-          <w:iCs w:val="0"/>
-          <w:color w:val="auto"/>
-        </w:rPr>
-        <w:t>`</w:t>
-      </w:r>
-      <w:r>
-        <w:rPr>
-          <w:rFonts w:eastAsiaTheme="minorHAnsi" w:cstheme="minorBidi"/>
-          <w:i w:val="0"/>
-          <w:iCs w:val="0"/>
-          <w:color w:val="auto"/>
-        </w:rPr>
-        <w:t xml:space="preserve"> </w:t>
-      </w:r>
-      <w:r>
-        <w:rPr>
-          <w:rFonts w:eastAsiaTheme="minorHAnsi" w:cstheme="minorBidi"/>
-          <w:i w:val="0"/>
-          <w:iCs w:val="0"/>
-          <w:color w:val="auto"/>
-        </w:rPr>
-        <w:t>from the power tools package in R</w:t>
-      </w:r>
-      <w:r>
-        <w:rPr>
-          <w:rFonts w:eastAsiaTheme="minorHAnsi" w:cstheme="minorBidi"/>
-          <w:i w:val="0"/>
-          <w:iCs w:val="0"/>
-          <w:color w:val="auto"/>
-        </w:rPr>
-        <w:t xml:space="preserve">. For Aim 2, which tests whether </w:t>
-      </w:r>
-      <w:r>
-        <w:rPr>
-          <w:rFonts w:eastAsiaTheme="minorHAnsi" w:cstheme="minorBidi"/>
-          <w:i w:val="0"/>
-          <w:iCs w:val="0"/>
-          <w:color w:val="auto"/>
-        </w:rPr>
-        <w:t>amyloid</w:t>
-      </w:r>
-      <w:r>
-        <w:rPr>
-          <w:rFonts w:eastAsiaTheme="minorHAnsi" w:cstheme="minorBidi"/>
-          <w:i w:val="0"/>
-          <w:iCs w:val="0"/>
-          <w:color w:val="auto"/>
-        </w:rPr>
-        <w:t xml:space="preserve"> </w:t>
-      </w:r>
-      <w:r>
-        <w:rPr>
-          <w:rFonts w:eastAsiaTheme="minorHAnsi" w:cstheme="minorBidi"/>
-          <w:i w:val="0"/>
-          <w:iCs w:val="0"/>
-          <w:color w:val="auto"/>
-        </w:rPr>
-        <w:t>deposition</w:t>
-      </w:r>
-      <w:r>
-        <w:rPr>
-          <w:rFonts w:eastAsiaTheme="minorHAnsi" w:cstheme="minorBidi"/>
-          <w:i w:val="0"/>
-          <w:iCs w:val="0"/>
-          <w:color w:val="auto"/>
-        </w:rPr>
-        <w:t xml:space="preserve"> (AD)</w:t>
-      </w:r>
-      <w:r>
-        <w:rPr>
-          <w:rFonts w:eastAsiaTheme="minorHAnsi" w:cstheme="minorBidi"/>
-          <w:i w:val="0"/>
-          <w:iCs w:val="0"/>
-          <w:color w:val="auto"/>
-        </w:rPr>
-        <w:t xml:space="preserve"> modifies the relationship between inflammation and </w:t>
-      </w:r>
-      <w:r>
-        <w:rPr>
-          <w:rFonts w:eastAsiaTheme="minorHAnsi" w:cstheme="minorBidi"/>
-          <w:i w:val="0"/>
-          <w:iCs w:val="0"/>
-          <w:color w:val="auto"/>
-        </w:rPr>
-        <w:t>year-1 outcomes</w:t>
-      </w:r>
-      <w:r>
-        <w:rPr>
-          <w:rFonts w:eastAsiaTheme="minorHAnsi" w:cstheme="minorBidi"/>
-          <w:i w:val="0"/>
-          <w:iCs w:val="0"/>
-          <w:color w:val="auto"/>
-        </w:rPr>
-        <w:t xml:space="preserve">, power will </w:t>
-      </w:r>
-      <w:r>
-        <w:rPr>
-          <w:rFonts w:eastAsiaTheme="minorHAnsi" w:cstheme="minorBidi"/>
-          <w:i w:val="0"/>
-          <w:iCs w:val="0"/>
-          <w:color w:val="auto"/>
-        </w:rPr>
-        <w:t>be evaluated</w:t>
-      </w:r>
-      <w:r>
-        <w:rPr>
-          <w:rFonts w:eastAsiaTheme="minorHAnsi" w:cstheme="minorBidi"/>
-          <w:i w:val="0"/>
-          <w:iCs w:val="0"/>
-          <w:color w:val="auto"/>
-        </w:rPr>
-        <w:t xml:space="preserve"> for the </w:t>
-      </w:r>
-      <w:r>
-        <w:rPr>
-          <w:rFonts w:eastAsiaTheme="minorHAnsi" w:cstheme="minorBidi"/>
-          <w:i w:val="0"/>
-          <w:iCs w:val="0"/>
-          <w:color w:val="auto"/>
-        </w:rPr>
-        <w:t>additional</w:t>
-      </w:r>
-      <w:r>
-        <w:rPr>
-          <w:rFonts w:eastAsiaTheme="minorHAnsi" w:cstheme="minorBidi"/>
-          <w:i w:val="0"/>
-          <w:iCs w:val="0"/>
-          <w:color w:val="auto"/>
-        </w:rPr>
-        <w:t xml:space="preserve"> variance explained by the </w:t>
-      </w:r>
-      <w:r>
-        <w:rPr>
-          <w:rFonts w:eastAsiaTheme="minorHAnsi" w:cstheme="minorBidi"/>
-          <w:i w:val="0"/>
-          <w:iCs w:val="0"/>
-          <w:color w:val="auto"/>
-        </w:rPr>
-        <w:t>AD x</w:t>
-      </w:r>
-      <w:r>
-        <w:rPr>
-          <w:rFonts w:eastAsiaTheme="minorHAnsi" w:cstheme="minorBidi"/>
-          <w:i w:val="0"/>
-          <w:iCs w:val="0"/>
-          <w:color w:val="auto"/>
-        </w:rPr>
-        <w:t xml:space="preserve"> </w:t>
-      </w:r>
-      <w:r>
-        <w:rPr>
-          <w:rFonts w:eastAsiaTheme="minorHAnsi" w:cstheme="minorBidi"/>
-          <w:i w:val="0"/>
-          <w:iCs w:val="0"/>
-          <w:color w:val="auto"/>
-        </w:rPr>
-        <w:t>inflammation</w:t>
-      </w:r>
-      <w:r>
-        <w:rPr>
-          <w:rFonts w:eastAsiaTheme="minorHAnsi" w:cstheme="minorBidi"/>
-          <w:i w:val="0"/>
-          <w:iCs w:val="0"/>
-          <w:color w:val="auto"/>
-        </w:rPr>
-        <w:t xml:space="preserve"> interaction</w:t>
-      </w:r>
-      <w:r>
-        <w:rPr>
-          <w:rFonts w:eastAsiaTheme="minorHAnsi" w:cstheme="minorBidi"/>
-          <w:i w:val="0"/>
-          <w:iCs w:val="0"/>
-          <w:color w:val="auto"/>
-        </w:rPr>
-        <w:t xml:space="preserve"> using </w:t>
-      </w:r>
-      <w:r>
-        <w:rPr>
-          <w:rFonts w:eastAsiaTheme="minorHAnsi" w:cstheme="minorBidi"/>
-          <w:i w:val="0"/>
-          <w:iCs w:val="0"/>
-          <w:color w:val="auto"/>
-        </w:rPr>
-        <w:t>`</w:t>
-      </w:r>
-      <w:proofErr w:type="spellStart"/>
-      <w:r>
-        <w:rPr>
-          <w:rFonts w:eastAsiaTheme="minorHAnsi" w:cstheme="minorBidi"/>
-          <w:i w:val="0"/>
-          <w:iCs w:val="0"/>
-          <w:color w:val="auto"/>
-        </w:rPr>
-        <w:t>mlrF.partia</w:t>
-      </w:r>
-      <w:r>
-        <w:rPr>
-          <w:rFonts w:eastAsiaTheme="minorHAnsi" w:cstheme="minorBidi"/>
-          <w:i w:val="0"/>
-          <w:iCs w:val="0"/>
-          <w:color w:val="auto"/>
-        </w:rPr>
-        <w:t>l</w:t>
-      </w:r>
-      <w:proofErr w:type="spellEnd"/>
-      <w:r>
-        <w:rPr>
-          <w:rFonts w:eastAsiaTheme="minorHAnsi" w:cstheme="minorBidi"/>
-          <w:i w:val="0"/>
-          <w:iCs w:val="0"/>
-          <w:color w:val="auto"/>
-        </w:rPr>
-        <w:t>`</w:t>
-      </w:r>
-      <w:r>
-        <w:rPr>
-          <w:rFonts w:eastAsiaTheme="minorHAnsi" w:cstheme="minorBidi"/>
-          <w:i w:val="0"/>
-          <w:iCs w:val="0"/>
-          <w:color w:val="auto"/>
-        </w:rPr>
-        <w:t xml:space="preserve"> </w:t>
-      </w:r>
-      <w:r>
-        <w:rPr>
-          <w:rFonts w:eastAsiaTheme="minorHAnsi" w:cstheme="minorBidi"/>
-          <w:i w:val="0"/>
-          <w:iCs w:val="0"/>
-          <w:color w:val="auto"/>
-        </w:rPr>
-        <w:t>or `corr.2samp`</w:t>
-      </w:r>
-      <w:r>
-        <w:rPr>
-          <w:rFonts w:eastAsiaTheme="minorHAnsi" w:cstheme="minorBidi"/>
-          <w:i w:val="0"/>
-          <w:iCs w:val="0"/>
-          <w:color w:val="auto"/>
-        </w:rPr>
-        <w:t xml:space="preserve">from the power tools package. </w:t>
-      </w:r>
-      <w:r>
-        <w:rPr>
-          <w:rFonts w:eastAsiaTheme="minorHAnsi" w:cstheme="minorBidi"/>
-          <w:i w:val="0"/>
-          <w:iCs w:val="0"/>
-          <w:color w:val="auto"/>
-        </w:rPr>
-        <w:t>We expect to gain more power by adjusting for covariates</w:t>
-      </w:r>
-    </w:p>
-    <w:p>
-      <w:pPr>
-        <w:pStyle w:val="Heading4"/>
-        <w:spacing w:before="0" w:after="0" w:line="240" w:lineRule="auto"/>
-        <w:rPr>
-          <w:rFonts w:eastAsiaTheme="minorHAnsi" w:cstheme="minorBidi"/>
-          <w:i w:val="0"/>
-          <w:iCs w:val="0"/>
-          <w:color w:val="auto"/>
-        </w:rPr>
-      </w:pPr>
-    </w:p>
-    <w:p>
-      <w:pPr>
-        <w:pStyle w:val="Heading4"/>
-        <w:spacing w:before="0" w:after="0" w:line="240" w:lineRule="auto"/>
-        <w:rPr>
-          <w:rFonts w:eastAsiaTheme="minorHAnsi" w:cstheme="minorBidi"/>
-          <w:i w:val="0"/>
-          <w:iCs w:val="0"/>
-          <w:color w:val="auto"/>
-        </w:rPr>
-      </w:pPr>
-      <w:r>
-        <w:rPr>
-          <w:rFonts w:eastAsiaTheme="minorHAnsi" w:cstheme="minorBidi"/>
-          <w:i w:val="0"/>
-          <w:iCs w:val="0"/>
-          <w:color w:val="auto"/>
-        </w:rPr>
-        <w:t xml:space="preserve">Because multiple cytokine/chemokine markers will be tested, </w:t>
-      </w:r>
-      <w:r>
-        <w:rPr>
-          <w:rFonts w:eastAsiaTheme="minorHAnsi" w:cstheme="minorBidi"/>
-          <w:i w:val="0"/>
-          <w:iCs w:val="0"/>
-          <w:color w:val="auto"/>
-        </w:rPr>
-        <w:t>we will control for multiple testing using Benjamini-Hochberg (false discovery rate).</w:t>
-      </w:r>
-      <w:r>
-        <w:rPr>
-          <w:rFonts w:eastAsiaTheme="minorHAnsi" w:cstheme="minorBidi"/>
-          <w:i w:val="0"/>
-          <w:iCs w:val="0"/>
-          <w:color w:val="auto"/>
-        </w:rPr>
-        <w:t xml:space="preserve"> If calculations indicate insufficient power for the hypothes</w:t>
-      </w:r>
-      <w:r>
-        <w:rPr>
-          <w:rFonts w:eastAsiaTheme="minorHAnsi" w:cstheme="minorBidi"/>
-          <w:i w:val="0"/>
-          <w:iCs w:val="0"/>
-          <w:color w:val="auto"/>
-        </w:rPr>
-        <w:t>es</w:t>
-      </w:r>
-      <w:r>
-        <w:rPr>
-          <w:rFonts w:eastAsiaTheme="minorHAnsi" w:cstheme="minorBidi"/>
-          <w:i w:val="0"/>
-          <w:iCs w:val="0"/>
-          <w:color w:val="auto"/>
-        </w:rPr>
-        <w:t xml:space="preserve">, </w:t>
-      </w:r>
-      <w:r>
-        <w:rPr>
-          <w:rFonts w:eastAsiaTheme="minorHAnsi" w:cstheme="minorBidi"/>
-          <w:i w:val="0"/>
-          <w:iCs w:val="0"/>
-          <w:color w:val="auto"/>
-        </w:rPr>
-        <w:t>we will propose new sample size estimations to achieve sufficient power.</w:t>
-      </w:r>
-    </w:p>
-    <w:p/>
-    <w:p/>
-    <w:p/>
-    <w:p/>
-    <w:p/>
     <w:p/>
     <w:p/>
     <w:p/>
     <w:p>
+      <w:pPr>
+        <w:pStyle w:val="Heading3"/>
+      </w:pPr>
+      <w:bookmarkStart w:id="14" w:name="_Toc224400997"/>
       <w:r>
         <w:lastRenderedPageBreak/>
-        <w:t xml:space="preserve">Power calculations will evaluate whether the proposed sample size of 137 aMCI and 55 healthy controls (yielding approximately 125 aMCI and 50 HC completing follow-up) provides adequate power to detect the hypothesized associations in Aims 1–2. Because both predictors (cytokine/chemokine levels) and outcomes (changes in cognitive performance and cortical thickness) are continuous, simplified power analyses will approximate the planned regression models using correlation-based methods (corr.1samp) from the </w:t>
+        <w:t xml:space="preserve">Data </w:t>
+      </w:r>
+      <w:r>
+        <w:t>Management and Cleaning</w:t>
+      </w:r>
+      <w:bookmarkEnd w:id="14"/>
+    </w:p>
+    <w:p>
+      <w:pPr>
+        <w:spacing w:line="480" w:lineRule="auto"/>
+      </w:pPr>
+      <w:r>
+        <w:t>Data will be collected from a study conducted at the Rocky Mountain Alzheimer’s Disease Center (RMADC) at the University of Colorado Anschutz Medical Campus and will include demographic and clinical variables, plasma inflammatory markers, cognitive assessments, structural neuroimaging, and amyloid PET measures collected at baseline and one-year follow-up</w:t>
+      </w:r>
+      <w:r>
+        <w:t xml:space="preserve">. </w:t>
+      </w:r>
+    </w:p>
+    <w:p>
+      <w:pPr>
+        <w:spacing w:line="480" w:lineRule="auto"/>
+      </w:pPr>
+      <w:r>
+        <w:t>Continuous outcomes will be evaluated for outliers, missingness, and distributional assumptions using graphical summaries and descriptive statistics, with transformations applied if needed. Participants excluded due to missing exposures or outcomes will be compared with the full cohort to evaluate potential bias.</w:t>
+      </w:r>
+      <w:r>
+        <w:t xml:space="preserve"> </w:t>
+      </w:r>
+      <w:r>
+        <w:t>Sensitivity analyses will assess whether results differ between the full dataset and the analytic subset.</w:t>
+      </w:r>
+    </w:p>
+    <w:p>
+      <w:pPr>
+        <w:pStyle w:val="Heading3"/>
+      </w:pPr>
+      <w:bookmarkStart w:id="15" w:name="_Toc224400998"/>
+      <w:r>
+        <w:t>General Analytical Framework</w:t>
+      </w:r>
+      <w:bookmarkEnd w:id="15"/>
+    </w:p>
+    <w:p>
+      <w:pPr>
+        <w:spacing w:line="480" w:lineRule="auto"/>
+      </w:pPr>
+      <w:r>
+        <w:t>Linear regression models will be used to estimate associations between inflammatory markers and one-year changes in cognitive performance and AD-signature cortical thickness, allowing adjustment for covariates and testing of interaction effects.</w:t>
+      </w:r>
+    </w:p>
+    <w:p>
+      <w:pPr>
+        <w:spacing w:line="480" w:lineRule="auto"/>
+      </w:pPr>
+      <w:r>
+        <w:t>Because preliminary analyses indicated weak correlation between the cognitive and cortical thickness outcomes, models will be estimated separately for each outcome.</w:t>
+      </w:r>
+    </w:p>
+    <w:p>
+      <w:pPr>
+        <w:spacing w:line="480" w:lineRule="auto"/>
+      </w:pPr>
+      <w:r>
+        <w:t>Statistical significance will be assessed using two-sided tests with a Bonferroni</w:t>
+      </w:r>
+      <w:r>
+        <w:t xml:space="preserve"> style</w:t>
+      </w:r>
+      <w:r>
+        <w:t>-adjusted significance level of α = 0.005 within each hypothesis family.</w:t>
+      </w:r>
+    </w:p>
+    <w:p>
+      <w:pPr>
+        <w:spacing w:line="480" w:lineRule="auto"/>
+      </w:pPr>
+      <w:r>
+        <w:lastRenderedPageBreak/>
+        <w:t>Because inflammatory markers and outcomes are expected to be correlated, results will be summarized by evaluating consistency in effect size and direction across related markers and outcomes rather than relying on isolated statistically significant findings.</w:t>
+      </w:r>
+    </w:p>
+    <w:p>
+      <w:pPr>
+        <w:pStyle w:val="Heading3"/>
+      </w:pPr>
+      <w:bookmarkStart w:id="16" w:name="_Toc224400999"/>
+      <w:r>
+        <w:t>Details of the Analyses</w:t>
+      </w:r>
+      <w:bookmarkEnd w:id="16"/>
+    </w:p>
+    <w:p>
+      <w:pPr>
+        <w:spacing w:line="480" w:lineRule="auto"/>
+      </w:pPr>
+      <w:bookmarkStart w:id="17" w:name="_Toc224401000"/>
+      <w:r>
+        <w:t>Primary outcomes are one-year changes in cognitive performance and AD-signature cortical thickness (five outcomes total), with higher values indicating worsening cognition or cortical thinning.</w:t>
+      </w:r>
+    </w:p>
+    <w:p>
+      <w:pPr>
+        <w:spacing w:line="480" w:lineRule="auto"/>
+      </w:pPr>
+      <w:r>
+        <w:t>Primary exposures include circulating inflammatory markers measured in plasma at baseline and at one-year follow-up. All models will adjust for age, sex, APOE genotype, baseline Clinical Dementia Rating (CDR), and baseline outcome value. Additional health-related variables associated with inflammatory processes (e.g., BMI, cardiovascular risk factors, NSAID use, immune-related health conditions) will be evaluated as potential confounders in sensitivity analyses.</w:t>
+      </w:r>
+    </w:p>
+    <w:p>
+      <w:pPr>
+        <w:spacing w:line="480" w:lineRule="auto"/>
+      </w:pPr>
+      <w:r>
+        <w:t>For Hypothesis H1a, linear regression models will evaluate associations between baseline inflammatory markers and one-year outcome changes. For Hypothesis H1b, models will evaluate whether one-year changes in inflammatory markers are associated with outcome changes.</w:t>
+      </w:r>
+    </w:p>
+    <w:p>
+      <w:pPr>
+        <w:spacing w:line="480" w:lineRule="auto"/>
+      </w:pPr>
+      <w:r>
+        <w:t xml:space="preserve">For Aim 2, models will extend Aim 1 by including amyloid deposition and an inflammation </w:t>
+      </w:r>
+      <w:r>
+        <w:t>x</w:t>
+      </w:r>
+      <w:r>
+        <w:t xml:space="preserve"> amyloid interaction term to assess whether amyloid modifies the association between inflammation and the outcomes.</w:t>
+      </w:r>
+    </w:p>
+    <w:p>
+      <w:pPr>
+        <w:spacing w:line="480" w:lineRule="auto"/>
+        <w:rPr>
+          <w:noProof/>
+        </w:rPr>
+      </w:pPr>
+      <w:r>
+        <w:lastRenderedPageBreak/>
+        <w:t>Amyloid deposition will be dichotomized using an SUVR threshold of 1.10, which demonstrated 97% sensitivity and 100% specificity for amyloid positivity</w:t>
+      </w:r>
+      <w:r>
+        <w:t xml:space="preserve"> in previous analyses</w:t>
+      </w:r>
+      <w:r>
+        <w:t>. An indicator variable will therefore be coded as binary (low vs high amyloid).</w:t>
+      </w:r>
+      <w:r>
+        <w:rPr>
+          <w:noProof/>
+        </w:rPr>
+        <w:t xml:space="preserve"> </w:t>
+      </w:r>
+    </w:p>
+    <w:p>
+      <w:r>
+        <w:rPr>
+          <w:noProof/>
+        </w:rPr>
+        <w:drawing>
+          <wp:inline distT="0" distB="0" distL="0" distR="0" wp14:anchorId="5D0A93BF" wp14:editId="565D8071">
+            <wp:extent cx="5943600" cy="1979295"/>
+            <wp:effectExtent l="0" t="0" r="0" b="1905"/>
+            <wp:docPr id="1798628141" name="Picture 1" descr="A screenshot of a medical report&#10;&#10;AI-generated content may be incorrect."/>
+            <wp:cNvGraphicFramePr>
+              <a:graphicFrameLocks xmlns:a="http://schemas.openxmlformats.org/drawingml/2006/main" noChangeAspect="1"/>
+            </wp:cNvGraphicFramePr>
+            <a:graphic xmlns:a="http://schemas.openxmlformats.org/drawingml/2006/main">
+              <a:graphicData uri="http://schemas.openxmlformats.org/drawingml/2006/picture">
+                <pic:pic xmlns:pic="http://schemas.openxmlformats.org/drawingml/2006/picture">
+                  <pic:nvPicPr>
+                    <pic:cNvPr id="1798628141" name="Picture 1" descr="A screenshot of a medical report&#10;&#10;AI-generated content may be incorrect."/>
+                    <pic:cNvPicPr/>
+                  </pic:nvPicPr>
+                  <pic:blipFill>
+                    <a:blip r:embed="rId6"/>
+                    <a:stretch>
+                      <a:fillRect/>
+                    </a:stretch>
+                  </pic:blipFill>
+                  <pic:spPr>
+                    <a:xfrm>
+                      <a:off x="0" y="0"/>
+                      <a:ext cx="5943600" cy="1979295"/>
+                    </a:xfrm>
+                    <a:prstGeom prst="rect">
+                      <a:avLst/>
+                    </a:prstGeom>
+                  </pic:spPr>
+                </pic:pic>
+              </a:graphicData>
+            </a:graphic>
+          </wp:inline>
+        </w:drawing>
+      </w:r>
+    </w:p>
+    <w:p>
+      <w:pPr>
+        <w:pStyle w:val="Heading3"/>
+      </w:pPr>
+      <w:r>
+        <w:t>Power Analysis</w:t>
+      </w:r>
+      <w:bookmarkEnd w:id="17"/>
+    </w:p>
+    <w:p>
+      <w:pPr>
+        <w:spacing w:before="100" w:beforeAutospacing="1" w:after="100" w:afterAutospacing="1" w:line="480" w:lineRule="auto"/>
+      </w:pPr>
+      <w:r>
+        <w:t xml:space="preserve">Power calculations were conducted assuming a final analytic sample size of N = 175. </w:t>
+      </w:r>
+    </w:p>
+    <w:p>
+      <w:pPr>
+        <w:spacing w:before="100" w:beforeAutospacing="1" w:after="100" w:afterAutospacing="1" w:line="480" w:lineRule="auto"/>
+      </w:pPr>
+      <w:r>
+        <w:t xml:space="preserve">Because inflammatory markers are classified into two biologically related </w:t>
+      </w:r>
+      <w:r>
+        <w:t>groupings</w:t>
+      </w:r>
+      <w:r>
+        <w:t xml:space="preserve"> (cytokines and chemokines), and preliminary data indicated strong correlation between representative markers (IL-6 and MCP-1; ρ = 0.93, 95% CI: 0.86–0.97), analyses were treated as evaluating two correlated </w:t>
+      </w:r>
+      <w:r>
+        <w:t>group</w:t>
+      </w:r>
+      <w:r>
+        <w:t>s</w:t>
+      </w:r>
+      <w:r>
+        <w:t xml:space="preserve"> rather than four independent predictors.</w:t>
+      </w:r>
+    </w:p>
+    <w:p>
+      <w:pPr>
+        <w:spacing w:before="100" w:beforeAutospacing="1" w:after="100" w:afterAutospacing="1" w:line="480" w:lineRule="auto"/>
+      </w:pPr>
+      <w:r>
+        <w:t xml:space="preserve">Accordingly, </w:t>
+      </w:r>
+      <w:r>
+        <w:t>multiple testing</w:t>
+      </w:r>
+      <w:r>
+        <w:t xml:space="preserve"> within each hypothesis was defined across five outcomes and </w:t>
+      </w:r>
+      <w:r>
+        <w:t>the two</w:t>
+      </w:r>
+      <w:r>
+        <w:t xml:space="preserve"> inflammatory </w:t>
+      </w:r>
+      <w:r>
+        <w:t>groups</w:t>
+      </w:r>
+      <w:r>
+        <w:t xml:space="preserve"> (</w:t>
+      </w:r>
+      <w:r>
+        <w:t xml:space="preserve">5 outcomes x 2 markers = </w:t>
+      </w:r>
+      <w:r>
+        <w:t>10 tests), and power calculations used a Bonferroni</w:t>
+      </w:r>
+      <w:r>
+        <w:t xml:space="preserve"> style</w:t>
+      </w:r>
+      <w:r>
+        <w:t xml:space="preserve">-adjusted two-sided α = 0.005 (0.05/10), with α = 0.0025 </w:t>
+      </w:r>
+      <w:r>
+        <w:t xml:space="preserve">(0.05/20) </w:t>
+      </w:r>
+      <w:r>
+        <w:t>evaluated as a conservative sensitivity analysis</w:t>
+      </w:r>
+      <w:r>
+        <w:t xml:space="preserve"> on the full Bonferroni-adjusted alpha</w:t>
+      </w:r>
+      <w:r>
+        <w:t>.</w:t>
+      </w:r>
+    </w:p>
+    <w:p>
+      <w:r>
+        <w:rPr>
+          <w:noProof/>
+        </w:rPr>
+        <w:lastRenderedPageBreak/>
+        <w:drawing>
+          <wp:inline distT="0" distB="0" distL="0" distR="0" wp14:anchorId="314717BE" wp14:editId="0F66A6AC">
+            <wp:extent cx="5943600" cy="3826510"/>
+            <wp:effectExtent l="0" t="0" r="0" b="0"/>
+            <wp:docPr id="674217966" name="Picture 1"/>
+            <wp:cNvGraphicFramePr>
+              <a:graphicFrameLocks xmlns:a="http://schemas.openxmlformats.org/drawingml/2006/main" noChangeAspect="1"/>
+            </wp:cNvGraphicFramePr>
+            <a:graphic xmlns:a="http://schemas.openxmlformats.org/drawingml/2006/main">
+              <a:graphicData uri="http://schemas.openxmlformats.org/drawingml/2006/picture">
+                <pic:pic xmlns:pic="http://schemas.openxmlformats.org/drawingml/2006/picture">
+                  <pic:nvPicPr>
+                    <pic:cNvPr id="674217966" name=""/>
+                    <pic:cNvPicPr/>
+                  </pic:nvPicPr>
+                  <pic:blipFill>
+                    <a:blip r:embed="rId7"/>
+                    <a:stretch>
+                      <a:fillRect/>
+                    </a:stretch>
+                  </pic:blipFill>
+                  <pic:spPr>
+                    <a:xfrm>
+                      <a:off x="0" y="0"/>
+                      <a:ext cx="5943600" cy="3826510"/>
+                    </a:xfrm>
+                    <a:prstGeom prst="rect">
+                      <a:avLst/>
+                    </a:prstGeom>
+                  </pic:spPr>
+                </pic:pic>
+              </a:graphicData>
+            </a:graphic>
+          </wp:inline>
+        </w:drawing>
+      </w:r>
+      <w:r>
+        <w:rPr>
+          <w:rFonts w:ascii="Times New Roman" w:hAnsi="Times New Roman" w:cs="Times New Roman"/>
+          <w:b/>
+          <w:bCs/>
+          <w:i/>
+          <w:iCs/>
+          <w:sz w:val="21"/>
+          <w:szCs w:val="21"/>
+        </w:rPr>
+        <w:t xml:space="preserve">Figure 1. Power to detect associations between inflammatory markers and outcomes at N = 175. </w:t>
+      </w:r>
+      <w:r>
+        <w:rPr>
+          <w:rFonts w:ascii="Times New Roman" w:hAnsi="Times New Roman" w:cs="Times New Roman"/>
+          <w:i/>
+          <w:iCs/>
+          <w:sz w:val="21"/>
+          <w:szCs w:val="21"/>
+        </w:rPr>
+        <w:t xml:space="preserve">Power curves illustrate the estimated power to detect associations between inflammatory markers (IL-6 and MCP-1) and one-year changes in cognitive performance (CVLTΔ) and AD-signature cortical thickness (CORTΔ), evaluated across a range of plausible correlations informed by preliminary data (±0.30 around pilot estimates). The dashed horizontal line represents 80% power, and vertical dotted lines indicate the minimum detectable correlation for each outcome and α level. </w:t>
+      </w:r>
+    </w:p>
+    <w:p>
+      <w:pPr>
+        <w:spacing w:before="100" w:beforeAutospacing="1" w:after="100" w:afterAutospacing="1" w:line="480" w:lineRule="auto"/>
+      </w:pPr>
+      <w:r>
+        <w:t>For Aim 1, although final analyses will use covariate-adjusted linear regression, power was approximated using correlation-based methods (</w:t>
       </w:r>
       <w:proofErr w:type="spellStart"/>
+      <w:proofErr w:type="gramStart"/>
       <w:r>
         <w:t>powertools</w:t>
       </w:r>
       <w:proofErr w:type="spellEnd"/>
       <w:r>
-        <w:t xml:space="preserve"> package in R. For Aim 2, which evaluates whether amyloid deposition modifies the relationship between inflammation and outcome changes, power will also be assessed for the additional variance explained by the inflammation × amyloid interaction using a multiple-regression partial F-test approach (</w:t>
+        <w:t>::</w:t>
+      </w:r>
+      <w:proofErr w:type="gramEnd"/>
+      <w:r>
+        <w:t xml:space="preserve">corr.1samp in R). Effect sizes were based on preliminary correlations between IL-6, MCP-1, and change outcomes (CVLT and AD-signature cortical thickness), and power was evaluated across ranges defined as ±0.30 around each </w:t>
+      </w:r>
+      <w:r>
+        <w:t xml:space="preserve">correlation </w:t>
+      </w:r>
+      <w:r>
+        <w:t>estimate.</w:t>
+      </w:r>
+    </w:p>
+    <w:p>
+      <w:pPr>
+        <w:spacing w:before="100" w:beforeAutospacing="1" w:after="100" w:afterAutospacing="1" w:line="240" w:lineRule="auto"/>
+        <w:jc w:val="center"/>
+        <w:rPr>
+          <w:rFonts w:ascii="Times New Roman" w:eastAsia="Times New Roman" w:hAnsi="Times New Roman" w:cs="Times New Roman"/>
+          <w:b/>
+          <w:bCs/>
+          <w:i/>
+          <w:iCs/>
+          <w:kern w:val="0"/>
+          <w:sz w:val="21"/>
+          <w:szCs w:val="21"/>
+          <w14:ligatures w14:val="none"/>
+        </w:rPr>
+      </w:pPr>
+      <w:r>
+        <w:rPr>
+          <w:rFonts w:ascii="Times New Roman" w:eastAsia="Times New Roman" w:hAnsi="Times New Roman" w:cs="Times New Roman"/>
+          <w:b/>
+          <w:bCs/>
+          <w:i/>
+          <w:iCs/>
+          <w:noProof/>
+          <w:kern w:val="0"/>
+          <w:sz w:val="21"/>
+          <w:szCs w:val="21"/>
+          <w14:ligatures w14:val="none"/>
+        </w:rPr>
+        <w:lastRenderedPageBreak/>
+        <w:drawing>
+          <wp:inline distT="0" distB="0" distL="0" distR="0" wp14:anchorId="7F61CD1D" wp14:editId="6C61D247">
+            <wp:extent cx="5359677" cy="3904090"/>
+            <wp:effectExtent l="0" t="0" r="0" b="0"/>
+            <wp:docPr id="1883880585" name="Picture 1"/>
+            <wp:cNvGraphicFramePr>
+              <a:graphicFrameLocks xmlns:a="http://schemas.openxmlformats.org/drawingml/2006/main" noChangeAspect="1"/>
+            </wp:cNvGraphicFramePr>
+            <a:graphic xmlns:a="http://schemas.openxmlformats.org/drawingml/2006/main">
+              <a:graphicData uri="http://schemas.openxmlformats.org/drawingml/2006/picture">
+                <pic:pic xmlns:pic="http://schemas.openxmlformats.org/drawingml/2006/picture">
+                  <pic:nvPicPr>
+                    <pic:cNvPr id="1883880585" name=""/>
+                    <pic:cNvPicPr/>
+                  </pic:nvPicPr>
+                  <pic:blipFill>
+                    <a:blip r:embed="rId8"/>
+                    <a:stretch>
+                      <a:fillRect/>
+                    </a:stretch>
+                  </pic:blipFill>
+                  <pic:spPr>
+                    <a:xfrm>
+                      <a:off x="0" y="0"/>
+                      <a:ext cx="5435154" cy="3959069"/>
+                    </a:xfrm>
+                    <a:prstGeom prst="rect">
+                      <a:avLst/>
+                    </a:prstGeom>
+                  </pic:spPr>
+                </pic:pic>
+              </a:graphicData>
+            </a:graphic>
+          </wp:inline>
+        </w:drawing>
+      </w:r>
+    </w:p>
+    <w:p>
+      <w:pPr>
+        <w:spacing w:before="100" w:beforeAutospacing="1" w:after="100" w:afterAutospacing="1" w:line="240" w:lineRule="auto"/>
+        <w:rPr>
+          <w:rFonts w:ascii="Times New Roman" w:eastAsia="Times New Roman" w:hAnsi="Times New Roman" w:cs="Times New Roman"/>
+          <w:i/>
+          <w:iCs/>
+          <w:kern w:val="0"/>
+          <w:sz w:val="21"/>
+          <w:szCs w:val="21"/>
+          <w14:ligatures w14:val="none"/>
+        </w:rPr>
+      </w:pPr>
+      <w:r>
+        <w:rPr>
+          <w:rFonts w:ascii="Times New Roman" w:eastAsia="Times New Roman" w:hAnsi="Times New Roman" w:cs="Times New Roman"/>
+          <w:b/>
+          <w:bCs/>
+          <w:i/>
+          <w:iCs/>
+          <w:kern w:val="0"/>
+          <w:sz w:val="21"/>
+          <w:szCs w:val="21"/>
+          <w14:ligatures w14:val="none"/>
+        </w:rPr>
+        <w:t xml:space="preserve">Figure 2. </w:t>
+      </w:r>
+      <w:r>
+        <w:rPr>
+          <w:rFonts w:ascii="Times New Roman" w:eastAsia="Times New Roman" w:hAnsi="Times New Roman" w:cs="Times New Roman"/>
+          <w:b/>
+          <w:bCs/>
+          <w:i/>
+          <w:iCs/>
+          <w:kern w:val="0"/>
+          <w:sz w:val="21"/>
+          <w:szCs w:val="21"/>
+          <w14:ligatures w14:val="none"/>
+        </w:rPr>
+        <w:t>Power to detect the inflammation × amyloid interaction at N = 175.</w:t>
+      </w:r>
+      <w:r>
+        <w:rPr>
+          <w:rFonts w:ascii="Times New Roman" w:eastAsia="Times New Roman" w:hAnsi="Times New Roman" w:cs="Times New Roman"/>
+          <w:i/>
+          <w:iCs/>
+          <w:kern w:val="0"/>
+          <w:sz w:val="21"/>
+          <w:szCs w:val="21"/>
+          <w14:ligatures w14:val="none"/>
+        </w:rPr>
+        <w:t xml:space="preserve"> </w:t>
+      </w:r>
+      <w:r>
+        <w:rPr>
+          <w:rFonts w:ascii="Times New Roman" w:eastAsia="Times New Roman" w:hAnsi="Times New Roman" w:cs="Times New Roman"/>
+          <w:i/>
+          <w:iCs/>
+          <w:kern w:val="0"/>
+          <w:sz w:val="21"/>
+          <w:szCs w:val="21"/>
+          <w14:ligatures w14:val="none"/>
+        </w:rPr>
+        <w:t xml:space="preserve">Power curves display the estimated power to detect the interaction between peripheral inflammation and amyloid deposition as a function of the assumed partial correlation for the interaction term. Negative values are shown to reflect the hypothesized direction of association (greater inflammation and amyloid associated with worse outcomes). The dashed horizontal line represents 80% power, and vertical dotted lines indicate the minimum detectable interaction effect size at each α level. </w:t>
+      </w:r>
+    </w:p>
+    <w:p>
+      <w:pPr>
+        <w:spacing w:before="100" w:beforeAutospacing="1" w:after="100" w:afterAutospacing="1" w:line="480" w:lineRule="auto"/>
+      </w:pPr>
+      <w:r>
+        <w:t xml:space="preserve">For Aim 2, because pilot data did not include amyloid deposition, power was evaluated across a plausible range of partial correlations using </w:t>
       </w:r>
       <w:proofErr w:type="spellStart"/>
+      <w:proofErr w:type="gramStart"/>
+      <w:r>
+        <w:t>powertools</w:t>
+      </w:r>
+      <w:proofErr w:type="spellEnd"/>
+      <w:r>
+        <w:t>::</w:t>
+      </w:r>
+      <w:proofErr w:type="spellStart"/>
+      <w:proofErr w:type="gramEnd"/>
       <w:r>
         <w:t>mlrF.partial</w:t>
       </w:r>
       <w:proofErr w:type="spellEnd"/>
       <w:r>
-        <w:t>). Because multiple cytokine and chemokine markers will be evaluated, false discovery rate control (Benjamini–Hochberg) will be used to account for multiple comparisons. If calculations indicate insufficient power for the proposed hypotheses, we will estimate the sample size required to achieve adequate power.</w:t>
+        <w:t xml:space="preserve"> in R. </w:t>
+      </w:r>
+      <w:r>
+        <w:t>We assumed t</w:t>
+      </w:r>
+      <w:r>
+        <w:t>he reduced model included six predictors (covariates plus inflammation and amyloid; p = 6), and the full model included the interaction term (q = 1).</w:t>
       </w:r>
     </w:p>
-    <w:p/>
+    <w:p>
+      <w:pPr>
+        <w:spacing w:before="100" w:beforeAutospacing="1" w:after="100" w:afterAutospacing="1" w:line="480" w:lineRule="auto"/>
+      </w:pPr>
+      <w:r>
+        <w:t xml:space="preserve">Power results (Figures 1–2) indicate that correlations of approximately |r| ≈ 0.28–0.39 are required to achieve 80% power for Aim 1, and partial correlations of approximately 0.27–0.29 for Aim 2, depending on </w:t>
+      </w:r>
+      <w:r>
+        <w:t>alpha</w:t>
+      </w:r>
+      <w:r>
+        <w:t>. These results suggest the proposed sample size is sufficient to detect moderate effects but may be underpowered for small effects.</w:t>
+      </w:r>
+    </w:p>
     <w:sectPr>
       <w:pgSz w:w="12240" w:h="15840"/>
       <w:pgMar w:top="1440" w:right="1440" w:bottom="1440" w:left="1440" w:header="720" w:footer="720" w:gutter="0"/>
@@ -1879,6 +1236,208 @@
     </w:lvl>
   </w:abstractNum>
   <w:abstractNum w:abstractNumId="1" w15:restartNumberingAfterBreak="0">
+    <w:nsid w:val="0B1C5D9B"/>
+    <w:multiLevelType w:val="hybridMultilevel"/>
+    <w:tmpl w:val="92A8B7C6"/>
+    <w:lvl w:ilvl="0" w:tplc="FFFFFFFF">
+      <w:start w:val="1"/>
+      <w:numFmt w:val="decimal"/>
+      <w:lvlText w:val="%1."/>
+      <w:lvlJc w:val="left"/>
+      <w:pPr>
+        <w:ind w:left="720" w:hanging="360"/>
+      </w:pPr>
+      <w:rPr>
+        <w:rFonts w:hint="default"/>
+      </w:rPr>
+    </w:lvl>
+    <w:lvl w:ilvl="1" w:tplc="FFFFFFFF">
+      <w:start w:val="1"/>
+      <w:numFmt w:val="lowerLetter"/>
+      <w:lvlText w:val="%2."/>
+      <w:lvlJc w:val="left"/>
+      <w:pPr>
+        <w:ind w:left="1440" w:hanging="360"/>
+      </w:pPr>
+    </w:lvl>
+    <w:lvl w:ilvl="2" w:tplc="FFFFFFFF" w:tentative="1">
+      <w:start w:val="1"/>
+      <w:numFmt w:val="lowerRoman"/>
+      <w:lvlText w:val="%3."/>
+      <w:lvlJc w:val="right"/>
+      <w:pPr>
+        <w:ind w:left="2160" w:hanging="180"/>
+      </w:pPr>
+    </w:lvl>
+    <w:lvl w:ilvl="3" w:tplc="FFFFFFFF" w:tentative="1">
+      <w:start w:val="1"/>
+      <w:numFmt w:val="decimal"/>
+      <w:lvlText w:val="%4."/>
+      <w:lvlJc w:val="left"/>
+      <w:pPr>
+        <w:ind w:left="2880" w:hanging="360"/>
+      </w:pPr>
+    </w:lvl>
+    <w:lvl w:ilvl="4" w:tplc="FFFFFFFF" w:tentative="1">
+      <w:start w:val="1"/>
+      <w:numFmt w:val="lowerLetter"/>
+      <w:lvlText w:val="%5."/>
+      <w:lvlJc w:val="left"/>
+      <w:pPr>
+        <w:ind w:left="3600" w:hanging="360"/>
+      </w:pPr>
+    </w:lvl>
+    <w:lvl w:ilvl="5" w:tplc="FFFFFFFF" w:tentative="1">
+      <w:start w:val="1"/>
+      <w:numFmt w:val="lowerRoman"/>
+      <w:lvlText w:val="%6."/>
+      <w:lvlJc w:val="right"/>
+      <w:pPr>
+        <w:ind w:left="4320" w:hanging="180"/>
+      </w:pPr>
+    </w:lvl>
+    <w:lvl w:ilvl="6" w:tplc="FFFFFFFF" w:tentative="1">
+      <w:start w:val="1"/>
+      <w:numFmt w:val="decimal"/>
+      <w:lvlText w:val="%7."/>
+      <w:lvlJc w:val="left"/>
+      <w:pPr>
+        <w:ind w:left="5040" w:hanging="360"/>
+      </w:pPr>
+    </w:lvl>
+    <w:lvl w:ilvl="7" w:tplc="FFFFFFFF" w:tentative="1">
+      <w:start w:val="1"/>
+      <w:numFmt w:val="lowerLetter"/>
+      <w:lvlText w:val="%8."/>
+      <w:lvlJc w:val="left"/>
+      <w:pPr>
+        <w:ind w:left="5760" w:hanging="360"/>
+      </w:pPr>
+    </w:lvl>
+    <w:lvl w:ilvl="8" w:tplc="FFFFFFFF" w:tentative="1">
+      <w:start w:val="1"/>
+      <w:numFmt w:val="lowerRoman"/>
+      <w:lvlText w:val="%9."/>
+      <w:lvlJc w:val="right"/>
+      <w:pPr>
+        <w:ind w:left="6480" w:hanging="180"/>
+      </w:pPr>
+    </w:lvl>
+  </w:abstractNum>
+  <w:abstractNum w:abstractNumId="2" w15:restartNumberingAfterBreak="0">
+    <w:nsid w:val="0E8112DD"/>
+    <w:multiLevelType w:val="hybridMultilevel"/>
+    <w:tmpl w:val="A55413D2"/>
+    <w:lvl w:ilvl="0" w:tplc="04090001">
+      <w:start w:val="1"/>
+      <w:numFmt w:val="bullet"/>
+      <w:lvlText w:val=""/>
+      <w:lvlJc w:val="left"/>
+      <w:pPr>
+        <w:ind w:left="720" w:hanging="360"/>
+      </w:pPr>
+      <w:rPr>
+        <w:rFonts w:ascii="Symbol" w:hAnsi="Symbol" w:hint="default"/>
+      </w:rPr>
+    </w:lvl>
+    <w:lvl w:ilvl="1" w:tplc="04090003" w:tentative="1">
+      <w:start w:val="1"/>
+      <w:numFmt w:val="bullet"/>
+      <w:lvlText w:val="o"/>
+      <w:lvlJc w:val="left"/>
+      <w:pPr>
+        <w:ind w:left="1440" w:hanging="360"/>
+      </w:pPr>
+      <w:rPr>
+        <w:rFonts w:ascii="Courier New" w:hAnsi="Courier New" w:cs="Courier New" w:hint="default"/>
+      </w:rPr>
+    </w:lvl>
+    <w:lvl w:ilvl="2" w:tplc="04090005" w:tentative="1">
+      <w:start w:val="1"/>
+      <w:numFmt w:val="bullet"/>
+      <w:lvlText w:val=""/>
+      <w:lvlJc w:val="left"/>
+      <w:pPr>
+        <w:ind w:left="2160" w:hanging="360"/>
+      </w:pPr>
+      <w:rPr>
+        <w:rFonts w:ascii="Wingdings" w:hAnsi="Wingdings" w:hint="default"/>
+      </w:rPr>
+    </w:lvl>
+    <w:lvl w:ilvl="3" w:tplc="04090001" w:tentative="1">
+      <w:start w:val="1"/>
+      <w:numFmt w:val="bullet"/>
+      <w:lvlText w:val=""/>
+      <w:lvlJc w:val="left"/>
+      <w:pPr>
+        <w:ind w:left="2880" w:hanging="360"/>
+      </w:pPr>
+      <w:rPr>
+        <w:rFonts w:ascii="Symbol" w:hAnsi="Symbol" w:hint="default"/>
+      </w:rPr>
+    </w:lvl>
+    <w:lvl w:ilvl="4" w:tplc="04090003" w:tentative="1">
+      <w:start w:val="1"/>
+      <w:numFmt w:val="bullet"/>
+      <w:lvlText w:val="o"/>
+      <w:lvlJc w:val="left"/>
+      <w:pPr>
+        <w:ind w:left="3600" w:hanging="360"/>
+      </w:pPr>
+      <w:rPr>
+        <w:rFonts w:ascii="Courier New" w:hAnsi="Courier New" w:cs="Courier New" w:hint="default"/>
+      </w:rPr>
+    </w:lvl>
+    <w:lvl w:ilvl="5" w:tplc="04090005" w:tentative="1">
+      <w:start w:val="1"/>
+      <w:numFmt w:val="bullet"/>
+      <w:lvlText w:val=""/>
+      <w:lvlJc w:val="left"/>
+      <w:pPr>
+        <w:ind w:left="4320" w:hanging="360"/>
+      </w:pPr>
+      <w:rPr>
+        <w:rFonts w:ascii="Wingdings" w:hAnsi="Wingdings" w:hint="default"/>
+      </w:rPr>
+    </w:lvl>
+    <w:lvl w:ilvl="6" w:tplc="04090001" w:tentative="1">
+      <w:start w:val="1"/>
+      <w:numFmt w:val="bullet"/>
+      <w:lvlText w:val=""/>
+      <w:lvlJc w:val="left"/>
+      <w:pPr>
+        <w:ind w:left="5040" w:hanging="360"/>
+      </w:pPr>
+      <w:rPr>
+        <w:rFonts w:ascii="Symbol" w:hAnsi="Symbol" w:hint="default"/>
+      </w:rPr>
+    </w:lvl>
+    <w:lvl w:ilvl="7" w:tplc="04090003" w:tentative="1">
+      <w:start w:val="1"/>
+      <w:numFmt w:val="bullet"/>
+      <w:lvlText w:val="o"/>
+      <w:lvlJc w:val="left"/>
+      <w:pPr>
+        <w:ind w:left="5760" w:hanging="360"/>
+      </w:pPr>
+      <w:rPr>
+        <w:rFonts w:ascii="Courier New" w:hAnsi="Courier New" w:cs="Courier New" w:hint="default"/>
+      </w:rPr>
+    </w:lvl>
+    <w:lvl w:ilvl="8" w:tplc="04090005" w:tentative="1">
+      <w:start w:val="1"/>
+      <w:numFmt w:val="bullet"/>
+      <w:lvlText w:val=""/>
+      <w:lvlJc w:val="left"/>
+      <w:pPr>
+        <w:ind w:left="6480" w:hanging="360"/>
+      </w:pPr>
+      <w:rPr>
+        <w:rFonts w:ascii="Wingdings" w:hAnsi="Wingdings" w:hint="default"/>
+      </w:rPr>
+    </w:lvl>
+  </w:abstractNum>
+  <w:abstractNum w:abstractNumId="3" w15:restartNumberingAfterBreak="0">
     <w:nsid w:val="1331659F"/>
     <w:multiLevelType w:val="hybridMultilevel"/>
     <w:tmpl w:val="A724882C"/>
@@ -1991,7 +1550,7 @@
       </w:rPr>
     </w:lvl>
   </w:abstractNum>
-  <w:abstractNum w:abstractNumId="2" w15:restartNumberingAfterBreak="0">
+  <w:abstractNum w:abstractNumId="4" w15:restartNumberingAfterBreak="0">
     <w:nsid w:val="1E5F4967"/>
     <w:multiLevelType w:val="multilevel"/>
     <w:tmpl w:val="573CEA18"/>
@@ -2104,7 +1663,7 @@
       </w:pPr>
     </w:lvl>
   </w:abstractNum>
-  <w:abstractNum w:abstractNumId="3" w15:restartNumberingAfterBreak="0">
+  <w:abstractNum w:abstractNumId="5" w15:restartNumberingAfterBreak="0">
     <w:nsid w:val="1F134B94"/>
     <w:multiLevelType w:val="hybridMultilevel"/>
     <w:tmpl w:val="92A8B7C6"/>
@@ -2193,7 +1752,7 @@
       </w:pPr>
     </w:lvl>
   </w:abstractNum>
-  <w:abstractNum w:abstractNumId="4" w15:restartNumberingAfterBreak="0">
+  <w:abstractNum w:abstractNumId="6" w15:restartNumberingAfterBreak="0">
     <w:nsid w:val="214474C3"/>
     <w:multiLevelType w:val="multilevel"/>
     <w:tmpl w:val="35DEF334"/>
@@ -2342,7 +1901,7 @@
       </w:rPr>
     </w:lvl>
   </w:abstractNum>
-  <w:abstractNum w:abstractNumId="5" w15:restartNumberingAfterBreak="0">
+  <w:abstractNum w:abstractNumId="7" w15:restartNumberingAfterBreak="0">
     <w:nsid w:val="2F017075"/>
     <w:multiLevelType w:val="hybridMultilevel"/>
     <w:tmpl w:val="188290F2"/>
@@ -2455,7 +2014,232 @@
       </w:rPr>
     </w:lvl>
   </w:abstractNum>
-  <w:abstractNum w:abstractNumId="6" w15:restartNumberingAfterBreak="0">
+  <w:abstractNum w:abstractNumId="8" w15:restartNumberingAfterBreak="0">
+    <w:nsid w:val="30306ADA"/>
+    <w:multiLevelType w:val="hybridMultilevel"/>
+    <w:tmpl w:val="275083A6"/>
+    <w:lvl w:ilvl="0" w:tplc="04090001">
+      <w:start w:val="1"/>
+      <w:numFmt w:val="bullet"/>
+      <w:lvlText w:val=""/>
+      <w:lvlJc w:val="left"/>
+      <w:pPr>
+        <w:ind w:left="720" w:hanging="360"/>
+      </w:pPr>
+      <w:rPr>
+        <w:rFonts w:ascii="Symbol" w:hAnsi="Symbol" w:hint="default"/>
+      </w:rPr>
+    </w:lvl>
+    <w:lvl w:ilvl="1" w:tplc="04090003" w:tentative="1">
+      <w:start w:val="1"/>
+      <w:numFmt w:val="bullet"/>
+      <w:lvlText w:val="o"/>
+      <w:lvlJc w:val="left"/>
+      <w:pPr>
+        <w:ind w:left="1440" w:hanging="360"/>
+      </w:pPr>
+      <w:rPr>
+        <w:rFonts w:ascii="Courier New" w:hAnsi="Courier New" w:cs="Courier New" w:hint="default"/>
+      </w:rPr>
+    </w:lvl>
+    <w:lvl w:ilvl="2" w:tplc="04090005" w:tentative="1">
+      <w:start w:val="1"/>
+      <w:numFmt w:val="bullet"/>
+      <w:lvlText w:val=""/>
+      <w:lvlJc w:val="left"/>
+      <w:pPr>
+        <w:ind w:left="2160" w:hanging="360"/>
+      </w:pPr>
+      <w:rPr>
+        <w:rFonts w:ascii="Wingdings" w:hAnsi="Wingdings" w:hint="default"/>
+      </w:rPr>
+    </w:lvl>
+    <w:lvl w:ilvl="3" w:tplc="04090001" w:tentative="1">
+      <w:start w:val="1"/>
+      <w:numFmt w:val="bullet"/>
+      <w:lvlText w:val=""/>
+      <w:lvlJc w:val="left"/>
+      <w:pPr>
+        <w:ind w:left="2880" w:hanging="360"/>
+      </w:pPr>
+      <w:rPr>
+        <w:rFonts w:ascii="Symbol" w:hAnsi="Symbol" w:hint="default"/>
+      </w:rPr>
+    </w:lvl>
+    <w:lvl w:ilvl="4" w:tplc="04090003" w:tentative="1">
+      <w:start w:val="1"/>
+      <w:numFmt w:val="bullet"/>
+      <w:lvlText w:val="o"/>
+      <w:lvlJc w:val="left"/>
+      <w:pPr>
+        <w:ind w:left="3600" w:hanging="360"/>
+      </w:pPr>
+      <w:rPr>
+        <w:rFonts w:ascii="Courier New" w:hAnsi="Courier New" w:cs="Courier New" w:hint="default"/>
+      </w:rPr>
+    </w:lvl>
+    <w:lvl w:ilvl="5" w:tplc="04090005" w:tentative="1">
+      <w:start w:val="1"/>
+      <w:numFmt w:val="bullet"/>
+      <w:lvlText w:val=""/>
+      <w:lvlJc w:val="left"/>
+      <w:pPr>
+        <w:ind w:left="4320" w:hanging="360"/>
+      </w:pPr>
+      <w:rPr>
+        <w:rFonts w:ascii="Wingdings" w:hAnsi="Wingdings" w:hint="default"/>
+      </w:rPr>
+    </w:lvl>
+    <w:lvl w:ilvl="6" w:tplc="04090001" w:tentative="1">
+      <w:start w:val="1"/>
+      <w:numFmt w:val="bullet"/>
+      <w:lvlText w:val=""/>
+      <w:lvlJc w:val="left"/>
+      <w:pPr>
+        <w:ind w:left="5040" w:hanging="360"/>
+      </w:pPr>
+      <w:rPr>
+        <w:rFonts w:ascii="Symbol" w:hAnsi="Symbol" w:hint="default"/>
+      </w:rPr>
+    </w:lvl>
+    <w:lvl w:ilvl="7" w:tplc="04090003" w:tentative="1">
+      <w:start w:val="1"/>
+      <w:numFmt w:val="bullet"/>
+      <w:lvlText w:val="o"/>
+      <w:lvlJc w:val="left"/>
+      <w:pPr>
+        <w:ind w:left="5760" w:hanging="360"/>
+      </w:pPr>
+      <w:rPr>
+        <w:rFonts w:ascii="Courier New" w:hAnsi="Courier New" w:cs="Courier New" w:hint="default"/>
+      </w:rPr>
+    </w:lvl>
+    <w:lvl w:ilvl="8" w:tplc="04090005" w:tentative="1">
+      <w:start w:val="1"/>
+      <w:numFmt w:val="bullet"/>
+      <w:lvlText w:val=""/>
+      <w:lvlJc w:val="left"/>
+      <w:pPr>
+        <w:ind w:left="6480" w:hanging="360"/>
+      </w:pPr>
+      <w:rPr>
+        <w:rFonts w:ascii="Wingdings" w:hAnsi="Wingdings" w:hint="default"/>
+      </w:rPr>
+    </w:lvl>
+  </w:abstractNum>
+  <w:abstractNum w:abstractNumId="9" w15:restartNumberingAfterBreak="0">
+    <w:nsid w:val="31EF4A04"/>
+    <w:multiLevelType w:val="hybridMultilevel"/>
+    <w:tmpl w:val="9C665B1E"/>
+    <w:lvl w:ilvl="0" w:tplc="C5FAB956">
+      <w:numFmt w:val="bullet"/>
+      <w:lvlText w:val=""/>
+      <w:lvlJc w:val="left"/>
+      <w:pPr>
+        <w:ind w:left="720" w:hanging="360"/>
+      </w:pPr>
+      <w:rPr>
+        <w:rFonts w:ascii="Symbol" w:eastAsiaTheme="minorHAnsi" w:hAnsi="Symbol" w:cstheme="minorBidi" w:hint="default"/>
+      </w:rPr>
+    </w:lvl>
+    <w:lvl w:ilvl="1" w:tplc="04090003" w:tentative="1">
+      <w:start w:val="1"/>
+      <w:numFmt w:val="bullet"/>
+      <w:lvlText w:val="o"/>
+      <w:lvlJc w:val="left"/>
+      <w:pPr>
+        <w:ind w:left="1440" w:hanging="360"/>
+      </w:pPr>
+      <w:rPr>
+        <w:rFonts w:ascii="Courier New" w:hAnsi="Courier New" w:cs="Courier New" w:hint="default"/>
+      </w:rPr>
+    </w:lvl>
+    <w:lvl w:ilvl="2" w:tplc="04090005" w:tentative="1">
+      <w:start w:val="1"/>
+      <w:numFmt w:val="bullet"/>
+      <w:lvlText w:val=""/>
+      <w:lvlJc w:val="left"/>
+      <w:pPr>
+        <w:ind w:left="2160" w:hanging="360"/>
+      </w:pPr>
+      <w:rPr>
+        <w:rFonts w:ascii="Wingdings" w:hAnsi="Wingdings" w:hint="default"/>
+      </w:rPr>
+    </w:lvl>
+    <w:lvl w:ilvl="3" w:tplc="04090001" w:tentative="1">
+      <w:start w:val="1"/>
+      <w:numFmt w:val="bullet"/>
+      <w:lvlText w:val=""/>
+      <w:lvlJc w:val="left"/>
+      <w:pPr>
+        <w:ind w:left="2880" w:hanging="360"/>
+      </w:pPr>
+      <w:rPr>
+        <w:rFonts w:ascii="Symbol" w:hAnsi="Symbol" w:hint="default"/>
+      </w:rPr>
+    </w:lvl>
+    <w:lvl w:ilvl="4" w:tplc="04090003" w:tentative="1">
+      <w:start w:val="1"/>
+      <w:numFmt w:val="bullet"/>
+      <w:lvlText w:val="o"/>
+      <w:lvlJc w:val="left"/>
+      <w:pPr>
+        <w:ind w:left="3600" w:hanging="360"/>
+      </w:pPr>
+      <w:rPr>
+        <w:rFonts w:ascii="Courier New" w:hAnsi="Courier New" w:cs="Courier New" w:hint="default"/>
+      </w:rPr>
+    </w:lvl>
+    <w:lvl w:ilvl="5" w:tplc="04090005" w:tentative="1">
+      <w:start w:val="1"/>
+      <w:numFmt w:val="bullet"/>
+      <w:lvlText w:val=""/>
+      <w:lvlJc w:val="left"/>
+      <w:pPr>
+        <w:ind w:left="4320" w:hanging="360"/>
+      </w:pPr>
+      <w:rPr>
+        <w:rFonts w:ascii="Wingdings" w:hAnsi="Wingdings" w:hint="default"/>
+      </w:rPr>
+    </w:lvl>
+    <w:lvl w:ilvl="6" w:tplc="04090001" w:tentative="1">
+      <w:start w:val="1"/>
+      <w:numFmt w:val="bullet"/>
+      <w:lvlText w:val=""/>
+      <w:lvlJc w:val="left"/>
+      <w:pPr>
+        <w:ind w:left="5040" w:hanging="360"/>
+      </w:pPr>
+      <w:rPr>
+        <w:rFonts w:ascii="Symbol" w:hAnsi="Symbol" w:hint="default"/>
+      </w:rPr>
+    </w:lvl>
+    <w:lvl w:ilvl="7" w:tplc="04090003" w:tentative="1">
+      <w:start w:val="1"/>
+      <w:numFmt w:val="bullet"/>
+      <w:lvlText w:val="o"/>
+      <w:lvlJc w:val="left"/>
+      <w:pPr>
+        <w:ind w:left="5760" w:hanging="360"/>
+      </w:pPr>
+      <w:rPr>
+        <w:rFonts w:ascii="Courier New" w:hAnsi="Courier New" w:cs="Courier New" w:hint="default"/>
+      </w:rPr>
+    </w:lvl>
+    <w:lvl w:ilvl="8" w:tplc="04090005" w:tentative="1">
+      <w:start w:val="1"/>
+      <w:numFmt w:val="bullet"/>
+      <w:lvlText w:val=""/>
+      <w:lvlJc w:val="left"/>
+      <w:pPr>
+        <w:ind w:left="6480" w:hanging="360"/>
+      </w:pPr>
+      <w:rPr>
+        <w:rFonts w:ascii="Wingdings" w:hAnsi="Wingdings" w:hint="default"/>
+      </w:rPr>
+    </w:lvl>
+  </w:abstractNum>
+  <w:abstractNum w:abstractNumId="10" w15:restartNumberingAfterBreak="0">
     <w:nsid w:val="40471CB1"/>
     <w:multiLevelType w:val="multilevel"/>
     <w:tmpl w:val="DA8CCA3E"/>
@@ -2604,7 +2388,7 @@
       </w:rPr>
     </w:lvl>
   </w:abstractNum>
-  <w:abstractNum w:abstractNumId="7" w15:restartNumberingAfterBreak="0">
+  <w:abstractNum w:abstractNumId="11" w15:restartNumberingAfterBreak="0">
     <w:nsid w:val="5BF33F4E"/>
     <w:multiLevelType w:val="hybridMultilevel"/>
     <w:tmpl w:val="A8426FE2"/>
@@ -2690,7 +2474,231 @@
       </w:pPr>
     </w:lvl>
   </w:abstractNum>
-  <w:abstractNum w:abstractNumId="8" w15:restartNumberingAfterBreak="0">
+  <w:abstractNum w:abstractNumId="12" w15:restartNumberingAfterBreak="0">
+    <w:nsid w:val="68280334"/>
+    <w:multiLevelType w:val="hybridMultilevel"/>
+    <w:tmpl w:val="15664E5A"/>
+    <w:lvl w:ilvl="0" w:tplc="C5FAB956">
+      <w:numFmt w:val="bullet"/>
+      <w:lvlText w:val=""/>
+      <w:lvlJc w:val="left"/>
+      <w:pPr>
+        <w:ind w:left="720" w:hanging="360"/>
+      </w:pPr>
+      <w:rPr>
+        <w:rFonts w:ascii="Symbol" w:eastAsiaTheme="minorHAnsi" w:hAnsi="Symbol" w:cstheme="minorBidi" w:hint="default"/>
+      </w:rPr>
+    </w:lvl>
+    <w:lvl w:ilvl="1" w:tplc="04090003" w:tentative="1">
+      <w:start w:val="1"/>
+      <w:numFmt w:val="bullet"/>
+      <w:lvlText w:val="o"/>
+      <w:lvlJc w:val="left"/>
+      <w:pPr>
+        <w:ind w:left="1440" w:hanging="360"/>
+      </w:pPr>
+      <w:rPr>
+        <w:rFonts w:ascii="Courier New" w:hAnsi="Courier New" w:cs="Courier New" w:hint="default"/>
+      </w:rPr>
+    </w:lvl>
+    <w:lvl w:ilvl="2" w:tplc="04090005" w:tentative="1">
+      <w:start w:val="1"/>
+      <w:numFmt w:val="bullet"/>
+      <w:lvlText w:val=""/>
+      <w:lvlJc w:val="left"/>
+      <w:pPr>
+        <w:ind w:left="2160" w:hanging="360"/>
+      </w:pPr>
+      <w:rPr>
+        <w:rFonts w:ascii="Wingdings" w:hAnsi="Wingdings" w:hint="default"/>
+      </w:rPr>
+    </w:lvl>
+    <w:lvl w:ilvl="3" w:tplc="04090001" w:tentative="1">
+      <w:start w:val="1"/>
+      <w:numFmt w:val="bullet"/>
+      <w:lvlText w:val=""/>
+      <w:lvlJc w:val="left"/>
+      <w:pPr>
+        <w:ind w:left="2880" w:hanging="360"/>
+      </w:pPr>
+      <w:rPr>
+        <w:rFonts w:ascii="Symbol" w:hAnsi="Symbol" w:hint="default"/>
+      </w:rPr>
+    </w:lvl>
+    <w:lvl w:ilvl="4" w:tplc="04090003" w:tentative="1">
+      <w:start w:val="1"/>
+      <w:numFmt w:val="bullet"/>
+      <w:lvlText w:val="o"/>
+      <w:lvlJc w:val="left"/>
+      <w:pPr>
+        <w:ind w:left="3600" w:hanging="360"/>
+      </w:pPr>
+      <w:rPr>
+        <w:rFonts w:ascii="Courier New" w:hAnsi="Courier New" w:cs="Courier New" w:hint="default"/>
+      </w:rPr>
+    </w:lvl>
+    <w:lvl w:ilvl="5" w:tplc="04090005" w:tentative="1">
+      <w:start w:val="1"/>
+      <w:numFmt w:val="bullet"/>
+      <w:lvlText w:val=""/>
+      <w:lvlJc w:val="left"/>
+      <w:pPr>
+        <w:ind w:left="4320" w:hanging="360"/>
+      </w:pPr>
+      <w:rPr>
+        <w:rFonts w:ascii="Wingdings" w:hAnsi="Wingdings" w:hint="default"/>
+      </w:rPr>
+    </w:lvl>
+    <w:lvl w:ilvl="6" w:tplc="04090001" w:tentative="1">
+      <w:start w:val="1"/>
+      <w:numFmt w:val="bullet"/>
+      <w:lvlText w:val=""/>
+      <w:lvlJc w:val="left"/>
+      <w:pPr>
+        <w:ind w:left="5040" w:hanging="360"/>
+      </w:pPr>
+      <w:rPr>
+        <w:rFonts w:ascii="Symbol" w:hAnsi="Symbol" w:hint="default"/>
+      </w:rPr>
+    </w:lvl>
+    <w:lvl w:ilvl="7" w:tplc="04090003" w:tentative="1">
+      <w:start w:val="1"/>
+      <w:numFmt w:val="bullet"/>
+      <w:lvlText w:val="o"/>
+      <w:lvlJc w:val="left"/>
+      <w:pPr>
+        <w:ind w:left="5760" w:hanging="360"/>
+      </w:pPr>
+      <w:rPr>
+        <w:rFonts w:ascii="Courier New" w:hAnsi="Courier New" w:cs="Courier New" w:hint="default"/>
+      </w:rPr>
+    </w:lvl>
+    <w:lvl w:ilvl="8" w:tplc="04090005" w:tentative="1">
+      <w:start w:val="1"/>
+      <w:numFmt w:val="bullet"/>
+      <w:lvlText w:val=""/>
+      <w:lvlJc w:val="left"/>
+      <w:pPr>
+        <w:ind w:left="6480" w:hanging="360"/>
+      </w:pPr>
+      <w:rPr>
+        <w:rFonts w:ascii="Wingdings" w:hAnsi="Wingdings" w:hint="default"/>
+      </w:rPr>
+    </w:lvl>
+  </w:abstractNum>
+  <w:abstractNum w:abstractNumId="13" w15:restartNumberingAfterBreak="0">
+    <w:nsid w:val="715D4458"/>
+    <w:multiLevelType w:val="hybridMultilevel"/>
+    <w:tmpl w:val="A54A8976"/>
+    <w:lvl w:ilvl="0" w:tplc="C5FAB956">
+      <w:numFmt w:val="bullet"/>
+      <w:lvlText w:val=""/>
+      <w:lvlJc w:val="left"/>
+      <w:pPr>
+        <w:ind w:left="720" w:hanging="360"/>
+      </w:pPr>
+      <w:rPr>
+        <w:rFonts w:ascii="Symbol" w:eastAsiaTheme="minorHAnsi" w:hAnsi="Symbol" w:cstheme="minorBidi" w:hint="default"/>
+      </w:rPr>
+    </w:lvl>
+    <w:lvl w:ilvl="1" w:tplc="04090003" w:tentative="1">
+      <w:start w:val="1"/>
+      <w:numFmt w:val="bullet"/>
+      <w:lvlText w:val="o"/>
+      <w:lvlJc w:val="left"/>
+      <w:pPr>
+        <w:ind w:left="1440" w:hanging="360"/>
+      </w:pPr>
+      <w:rPr>
+        <w:rFonts w:ascii="Courier New" w:hAnsi="Courier New" w:cs="Courier New" w:hint="default"/>
+      </w:rPr>
+    </w:lvl>
+    <w:lvl w:ilvl="2" w:tplc="04090005" w:tentative="1">
+      <w:start w:val="1"/>
+      <w:numFmt w:val="bullet"/>
+      <w:lvlText w:val=""/>
+      <w:lvlJc w:val="left"/>
+      <w:pPr>
+        <w:ind w:left="2160" w:hanging="360"/>
+      </w:pPr>
+      <w:rPr>
+        <w:rFonts w:ascii="Wingdings" w:hAnsi="Wingdings" w:hint="default"/>
+      </w:rPr>
+    </w:lvl>
+    <w:lvl w:ilvl="3" w:tplc="04090001" w:tentative="1">
+      <w:start w:val="1"/>
+      <w:numFmt w:val="bullet"/>
+      <w:lvlText w:val=""/>
+      <w:lvlJc w:val="left"/>
+      <w:pPr>
+        <w:ind w:left="2880" w:hanging="360"/>
+      </w:pPr>
+      <w:rPr>
+        <w:rFonts w:ascii="Symbol" w:hAnsi="Symbol" w:hint="default"/>
+      </w:rPr>
+    </w:lvl>
+    <w:lvl w:ilvl="4" w:tplc="04090003" w:tentative="1">
+      <w:start w:val="1"/>
+      <w:numFmt w:val="bullet"/>
+      <w:lvlText w:val="o"/>
+      <w:lvlJc w:val="left"/>
+      <w:pPr>
+        <w:ind w:left="3600" w:hanging="360"/>
+      </w:pPr>
+      <w:rPr>
+        <w:rFonts w:ascii="Courier New" w:hAnsi="Courier New" w:cs="Courier New" w:hint="default"/>
+      </w:rPr>
+    </w:lvl>
+    <w:lvl w:ilvl="5" w:tplc="04090005" w:tentative="1">
+      <w:start w:val="1"/>
+      <w:numFmt w:val="bullet"/>
+      <w:lvlText w:val=""/>
+      <w:lvlJc w:val="left"/>
+      <w:pPr>
+        <w:ind w:left="4320" w:hanging="360"/>
+      </w:pPr>
+      <w:rPr>
+        <w:rFonts w:ascii="Wingdings" w:hAnsi="Wingdings" w:hint="default"/>
+      </w:rPr>
+    </w:lvl>
+    <w:lvl w:ilvl="6" w:tplc="04090001" w:tentative="1">
+      <w:start w:val="1"/>
+      <w:numFmt w:val="bullet"/>
+      <w:lvlText w:val=""/>
+      <w:lvlJc w:val="left"/>
+      <w:pPr>
+        <w:ind w:left="5040" w:hanging="360"/>
+      </w:pPr>
+      <w:rPr>
+        <w:rFonts w:ascii="Symbol" w:hAnsi="Symbol" w:hint="default"/>
+      </w:rPr>
+    </w:lvl>
+    <w:lvl w:ilvl="7" w:tplc="04090003" w:tentative="1">
+      <w:start w:val="1"/>
+      <w:numFmt w:val="bullet"/>
+      <w:lvlText w:val="o"/>
+      <w:lvlJc w:val="left"/>
+      <w:pPr>
+        <w:ind w:left="5760" w:hanging="360"/>
+      </w:pPr>
+      <w:rPr>
+        <w:rFonts w:ascii="Courier New" w:hAnsi="Courier New" w:cs="Courier New" w:hint="default"/>
+      </w:rPr>
+    </w:lvl>
+    <w:lvl w:ilvl="8" w:tplc="04090005" w:tentative="1">
+      <w:start w:val="1"/>
+      <w:numFmt w:val="bullet"/>
+      <w:lvlText w:val=""/>
+      <w:lvlJc w:val="left"/>
+      <w:pPr>
+        <w:ind w:left="6480" w:hanging="360"/>
+      </w:pPr>
+      <w:rPr>
+        <w:rFonts w:ascii="Wingdings" w:hAnsi="Wingdings" w:hint="default"/>
+      </w:rPr>
+    </w:lvl>
+  </w:abstractNum>
+  <w:abstractNum w:abstractNumId="14" w15:restartNumberingAfterBreak="0">
     <w:nsid w:val="79E17A82"/>
     <w:multiLevelType w:val="hybridMultilevel"/>
     <w:tmpl w:val="4C1AF1E6"/>
@@ -2777,31 +2785,49 @@
     </w:lvl>
   </w:abstractNum>
   <w:num w:numId="1" w16cid:durableId="636302049">
-    <w:abstractNumId w:val="2"/>
+    <w:abstractNumId w:val="4"/>
   </w:num>
   <w:num w:numId="2" w16cid:durableId="1785618220">
-    <w:abstractNumId w:val="4"/>
+    <w:abstractNumId w:val="6"/>
   </w:num>
   <w:num w:numId="3" w16cid:durableId="464080542">
-    <w:abstractNumId w:val="7"/>
+    <w:abstractNumId w:val="11"/>
   </w:num>
   <w:num w:numId="4" w16cid:durableId="1792894366">
     <w:abstractNumId w:val="0"/>
   </w:num>
   <w:num w:numId="5" w16cid:durableId="1436707407">
+    <w:abstractNumId w:val="7"/>
+  </w:num>
+  <w:num w:numId="6" w16cid:durableId="1909225803">
+    <w:abstractNumId w:val="3"/>
+  </w:num>
+  <w:num w:numId="7" w16cid:durableId="1912764802">
     <w:abstractNumId w:val="5"/>
   </w:num>
-  <w:num w:numId="6" w16cid:durableId="1909225803">
+  <w:num w:numId="8" w16cid:durableId="770853444">
+    <w:abstractNumId w:val="10"/>
+  </w:num>
+  <w:num w:numId="9" w16cid:durableId="712191889">
+    <w:abstractNumId w:val="14"/>
+  </w:num>
+  <w:num w:numId="10" w16cid:durableId="1154837085">
+    <w:abstractNumId w:val="8"/>
+  </w:num>
+  <w:num w:numId="11" w16cid:durableId="1473669199">
     <w:abstractNumId w:val="1"/>
   </w:num>
-  <w:num w:numId="7" w16cid:durableId="1912764802">
-    <w:abstractNumId w:val="3"/>
+  <w:num w:numId="12" w16cid:durableId="1579097129">
+    <w:abstractNumId w:val="2"/>
   </w:num>
-  <w:num w:numId="8" w16cid:durableId="770853444">
-    <w:abstractNumId w:val="6"/>
+  <w:num w:numId="13" w16cid:durableId="1784419224">
+    <w:abstractNumId w:val="13"/>
   </w:num>
-  <w:num w:numId="9" w16cid:durableId="712191889">
-    <w:abstractNumId w:val="8"/>
+  <w:num w:numId="14" w16cid:durableId="626469849">
+    <w:abstractNumId w:val="12"/>
+  </w:num>
+  <w:num w:numId="15" w16cid:durableId="351759892">
+    <w:abstractNumId w:val="9"/>
   </w:num>
 </w:numbering>
 </file>
@@ -3206,6 +3232,7 @@
   <w:style w:type="paragraph" w:default="1" w:styleId="Normal">
     <w:name w:val="Normal"/>
     <w:qFormat/>
+    <w:rsid w:val="00ED1588"/>
   </w:style>
   <w:style w:type="paragraph" w:styleId="Heading1">
     <w:name w:val="heading 1"/>
@@ -3405,6 +3432,7 @@
   <w:style w:type="character" w:default="1" w:styleId="DefaultParagraphFont">
     <w:name w:val="Default Paragraph Font"/>
     <w:uiPriority w:val="1"/>
+    <w:semiHidden/>
     <w:unhideWhenUsed/>
   </w:style>
   <w:style w:type="table" w:default="1" w:styleId="TableNormal">
@@ -3881,14 +3909,19 @@
     <w:next w:val="Normal"/>
     <w:autoRedefine/>
     <w:uiPriority w:val="39"/>
-    <w:semiHidden/>
     <w:unhideWhenUsed/>
-    <w:rsid w:val="00A65C67"/>
+    <w:rsid w:val="00E77C2A"/>
     <w:pPr>
+      <w:tabs>
+        <w:tab w:val="right" w:leader="dot" w:pos="9350"/>
+      </w:tabs>
       <w:spacing w:after="0"/>
       <w:ind w:left="480"/>
     </w:pPr>
     <w:rPr>
+      <w:b/>
+      <w:bCs/>
+      <w:noProof/>
       <w:sz w:val="20"/>
       <w:szCs w:val="20"/>
     </w:rPr>
@@ -4027,6 +4060,24 @@
     <w:pPr>
       <w:spacing w:after="0" w:line="240" w:lineRule="auto"/>
     </w:pPr>
+  </w:style>
+  <w:style w:type="paragraph" w:customStyle="1" w:styleId="p2">
+    <w:name w:val="p2"/>
+    <w:basedOn w:val="Normal"/>
+    <w:rsid w:val="00CB03A3"/>
+    <w:pPr>
+      <w:spacing w:before="100" w:beforeAutospacing="1" w:after="100" w:afterAutospacing="1" w:line="240" w:lineRule="auto"/>
+    </w:pPr>
+    <w:rPr>
+      <w:rFonts w:ascii="Times New Roman" w:eastAsia="Times New Roman" w:hAnsi="Times New Roman" w:cs="Times New Roman"/>
+      <w:kern w:val="0"/>
+      <w14:ligatures w14:val="none"/>
+    </w:rPr>
+  </w:style>
+  <w:style w:type="character" w:customStyle="1" w:styleId="s2">
+    <w:name w:val="s2"/>
+    <w:basedOn w:val="DefaultParagraphFont"/>
+    <w:rsid w:val="00CB03A3"/>
   </w:style>
 </w:styles>
 </file>

</xml_diff>

<commit_message>
minor edits to presentation and report. ready for final submission.
</commit_message>
<xml_diff>
--- a/Project2/Reports/Project2_Final_Analysis_Plan.docx
+++ b/Project2/Reports/Project2_Final_Analysis_Plan.docx
@@ -5,6 +5,7 @@
     <w:p>
       <w:pPr>
         <w:pStyle w:val="Heading2"/>
+        <w:spacing w:before="0" w:after="0" w:line="480" w:lineRule="auto"/>
         <w:jc w:val="center"/>
         <w:rPr>
           <w:b/>
@@ -62,6 +63,7 @@
     <w:p>
       <w:pPr>
         <w:pStyle w:val="Heading2"/>
+        <w:spacing w:before="0" w:after="0" w:line="480" w:lineRule="auto"/>
         <w:jc w:val="center"/>
         <w:rPr>
           <w:b/>
@@ -92,9 +94,14 @@
       <w:bookmarkEnd w:id="12"/>
       <w:bookmarkEnd w:id="13"/>
     </w:p>
-    <w:p/>
     <w:p>
       <w:pPr>
+        <w:spacing w:after="0" w:line="480" w:lineRule="auto"/>
+      </w:pPr>
+    </w:p>
+    <w:p>
+      <w:pPr>
+        <w:spacing w:after="0" w:line="240" w:lineRule="auto"/>
         <w:contextualSpacing/>
         <w:jc w:val="center"/>
       </w:pPr>
@@ -104,6 +111,7 @@
     </w:p>
     <w:p>
       <w:pPr>
+        <w:spacing w:after="0" w:line="240" w:lineRule="auto"/>
         <w:contextualSpacing/>
         <w:jc w:val="center"/>
       </w:pPr>
@@ -114,11 +122,18 @@
         <w:t>/</w:t>
       </w:r>
       <w:r>
-        <w:t>11</w:t>
+        <w:t>30</w:t>
       </w:r>
       <w:r>
         <w:t>/26</w:t>
       </w:r>
+    </w:p>
+    <w:p>
+      <w:pPr>
+        <w:spacing w:after="0" w:line="480" w:lineRule="auto"/>
+        <w:contextualSpacing/>
+        <w:jc w:val="center"/>
+      </w:pPr>
     </w:p>
     <w:sdt>
       <w:sdtPr>
@@ -147,6 +162,7 @@
         <w:p>
           <w:pPr>
             <w:pStyle w:val="TOCHeading"/>
+            <w:spacing w:before="0" w:line="480" w:lineRule="auto"/>
             <w:rPr>
               <w:noProof/>
               <w:sz w:val="24"/>
@@ -185,11 +201,11 @@
             </w:rPr>
             <w:fldChar w:fldCharType="separate"/>
           </w:r>
-          <w:hyperlink w:anchor="_Toc224400996" w:history="1"/>
         </w:p>
         <w:p>
           <w:pPr>
             <w:pStyle w:val="TOC3"/>
+            <w:spacing w:line="480" w:lineRule="auto"/>
             <w:rPr>
               <w:rFonts w:eastAsiaTheme="minorEastAsia"/>
               <w:sz w:val="24"/>
@@ -249,6 +265,7 @@
         <w:p>
           <w:pPr>
             <w:pStyle w:val="TOC3"/>
+            <w:spacing w:line="480" w:lineRule="auto"/>
             <w:rPr>
               <w:rFonts w:eastAsiaTheme="minorEastAsia"/>
               <w:sz w:val="24"/>
@@ -308,6 +325,7 @@
         <w:p>
           <w:pPr>
             <w:pStyle w:val="TOC3"/>
+            <w:spacing w:line="480" w:lineRule="auto"/>
             <w:rPr>
               <w:rFonts w:eastAsiaTheme="minorEastAsia"/>
               <w:sz w:val="24"/>
@@ -367,6 +385,7 @@
         <w:p>
           <w:pPr>
             <w:pStyle w:val="TOC3"/>
+            <w:spacing w:line="480" w:lineRule="auto"/>
             <w:rPr>
               <w:rFonts w:eastAsiaTheme="minorEastAsia"/>
               <w:sz w:val="24"/>
@@ -413,7 +432,7 @@
               <w:rPr>
                 <w:webHidden/>
               </w:rPr>
-              <w:t>4</w:t>
+              <w:t>3</w:t>
             </w:r>
             <w:r>
               <w:rPr>
@@ -424,6 +443,9 @@
           </w:hyperlink>
         </w:p>
         <w:p>
+          <w:pPr>
+            <w:spacing w:after="0" w:line="480" w:lineRule="auto"/>
+          </w:pPr>
           <w:r>
             <w:rPr>
               <w:b/>
@@ -438,39 +460,41 @@
     <w:p>
       <w:pPr>
         <w:pStyle w:val="Heading2"/>
-        <w:spacing w:before="0" w:after="0" w:line="240" w:lineRule="auto"/>
+        <w:spacing w:before="0" w:after="0" w:line="480" w:lineRule="auto"/>
         <w:contextualSpacing/>
       </w:pPr>
     </w:p>
     <w:p>
       <w:pPr>
         <w:pStyle w:val="Heading2"/>
-        <w:spacing w:before="0" w:after="0" w:line="240" w:lineRule="auto"/>
+        <w:spacing w:before="0" w:after="0" w:line="480" w:lineRule="auto"/>
         <w:contextualSpacing/>
       </w:pPr>
     </w:p>
     <w:p>
       <w:pPr>
         <w:pStyle w:val="Heading2"/>
-        <w:spacing w:before="0" w:after="0" w:line="240" w:lineRule="auto"/>
+        <w:spacing w:before="0" w:after="0" w:line="480" w:lineRule="auto"/>
         <w:contextualSpacing/>
       </w:pPr>
     </w:p>
     <w:p>
       <w:pPr>
         <w:pStyle w:val="Heading2"/>
-        <w:spacing w:before="0" w:after="0" w:line="240" w:lineRule="auto"/>
+        <w:spacing w:before="0" w:after="0" w:line="480" w:lineRule="auto"/>
         <w:contextualSpacing/>
       </w:pPr>
     </w:p>
     <w:p>
       <w:pPr>
         <w:pStyle w:val="Heading2"/>
+        <w:spacing w:before="0" w:after="0" w:line="480" w:lineRule="auto"/>
       </w:pPr>
     </w:p>
     <w:p>
       <w:pPr>
         <w:pStyle w:val="Heading2"/>
+        <w:spacing w:before="0" w:after="0" w:line="480" w:lineRule="auto"/>
         <w:rPr>
           <w:i/>
           <w:iCs/>
@@ -481,6 +505,7 @@
     </w:p>
     <w:p>
       <w:pPr>
+        <w:spacing w:after="0" w:line="480" w:lineRule="auto"/>
         <w:jc w:val="center"/>
         <w:rPr>
           <w:color w:val="000000" w:themeColor="text1"/>
@@ -489,6 +514,7 @@
     </w:p>
     <w:p>
       <w:pPr>
+        <w:spacing w:after="0" w:line="480" w:lineRule="auto"/>
         <w:jc w:val="center"/>
         <w:rPr>
           <w:color w:val="000000" w:themeColor="text1"/>
@@ -497,6 +523,7 @@
     </w:p>
     <w:p>
       <w:pPr>
+        <w:spacing w:after="0" w:line="480" w:lineRule="auto"/>
         <w:jc w:val="center"/>
         <w:rPr>
           <w:color w:val="000000" w:themeColor="text1"/>
@@ -505,6 +532,7 @@
     </w:p>
     <w:p>
       <w:pPr>
+        <w:spacing w:after="0" w:line="480" w:lineRule="auto"/>
         <w:jc w:val="center"/>
         <w:rPr>
           <w:color w:val="000000" w:themeColor="text1"/>
@@ -513,34 +541,8 @@
     </w:p>
     <w:p>
       <w:pPr>
-        <w:jc w:val="center"/>
-        <w:rPr>
-          <w:color w:val="000000" w:themeColor="text1"/>
-        </w:rPr>
-      </w:pPr>
-    </w:p>
-    <w:p>
-      <w:pPr>
-        <w:jc w:val="center"/>
-        <w:rPr>
-          <w:color w:val="000000" w:themeColor="text1"/>
-        </w:rPr>
-      </w:pPr>
-    </w:p>
-    <w:p>
-      <w:pPr>
-        <w:jc w:val="center"/>
-        <w:rPr>
-          <w:color w:val="000000" w:themeColor="text1"/>
-        </w:rPr>
-      </w:pPr>
-    </w:p>
-    <w:p/>
-    <w:p/>
-    <w:p/>
-    <w:p>
-      <w:pPr>
         <w:pStyle w:val="Heading3"/>
+        <w:spacing w:before="0" w:after="0" w:line="480" w:lineRule="auto"/>
       </w:pPr>
       <w:bookmarkStart w:id="14" w:name="_Toc224400997"/>
       <w:r>
@@ -555,33 +557,31 @@
     <w:p>
       <w:pPr>
         <w:spacing w:line="480" w:lineRule="auto"/>
-      </w:pPr>
-      <w:r>
-        <w:t>Data will be collected from a study conducted at the Rocky Mountain Alzheimer’s Disease Center (RMADC) at the University of Colorado Anschutz Medical Campus and will include demographic and clinical variables, plasma inflammatory markers, cognitive assessments, structural neuroimaging, and amyloid PET measures collected at baseline and one-year follow-up</w:t>
-      </w:r>
-      <w:r>
-        <w:t xml:space="preserve">. </w:t>
+        <w:contextualSpacing/>
+      </w:pPr>
+      <w:bookmarkStart w:id="15" w:name="_Toc224400998"/>
+      <w:r>
+        <w:t xml:space="preserve">Data will be screened for outliers, missingness, </w:t>
+      </w:r>
+      <w:r>
+        <w:t xml:space="preserve">correlations, </w:t>
+      </w:r>
+      <w:r>
+        <w:t>and distributional assumptions using graphical summaries and descriptive statistics, with transformations applied as needed. Participants excluded due to missing data will be compared with the full cohort to evaluate potential bias</w:t>
+      </w:r>
+      <w:r>
+        <w:t>es</w:t>
+      </w:r>
+      <w:r>
+        <w:t>.</w:t>
       </w:r>
     </w:p>
     <w:p>
       <w:pPr>
-        <w:spacing w:line="480" w:lineRule="auto"/>
-      </w:pPr>
-      <w:r>
-        <w:t>Continuous outcomes will be evaluated for outliers, missingness, and distributional assumptions using graphical summaries and descriptive statistics, with transformations applied if needed. Participants excluded due to missing exposures or outcomes will be compared with the full cohort to evaluate potential bias.</w:t>
-      </w:r>
-      <w:r>
-        <w:t xml:space="preserve"> </w:t>
-      </w:r>
-      <w:r>
-        <w:t>Sensitivity analyses will assess whether results differ between the full dataset and the analytic subset.</w:t>
-      </w:r>
-    </w:p>
-    <w:p>
-      <w:pPr>
         <w:pStyle w:val="Heading3"/>
-      </w:pPr>
-      <w:bookmarkStart w:id="15" w:name="_Toc224400998"/>
+        <w:spacing w:before="0" w:after="0" w:line="480" w:lineRule="auto"/>
+        <w:contextualSpacing/>
+      </w:pPr>
       <w:r>
         <w:t>General Analytical Framework</w:t>
       </w:r>
@@ -591,8 +591,12 @@
       <w:pPr>
         <w:spacing w:line="480" w:lineRule="auto"/>
       </w:pPr>
-      <w:r>
-        <w:t>Linear regression models will be used to estimate associations between inflammatory markers and one-year changes in cognitive performance and AD-signature cortical thickness, allowing adjustment for covariates and testing of interaction effects.</w:t>
+      <w:bookmarkStart w:id="16" w:name="_Toc224400999"/>
+      <w:r>
+        <w:t>Linear regression models will estimate associations between inflammatory markers and one-year changes in each outcome, allowing adjustment for covariates and testing of interaction effects.</w:t>
+      </w:r>
+      <w:r>
+        <w:t xml:space="preserve"> </w:t>
       </w:r>
     </w:p>
     <w:p>
@@ -600,115 +604,182 @@
         <w:spacing w:line="480" w:lineRule="auto"/>
       </w:pPr>
       <w:r>
-        <w:t>Because preliminary analyses indicated weak correlation between the cognitive and cortical thickness outcomes, models will be estimated separately for each outcome.</w:t>
+        <w:t xml:space="preserve">To address multiplicity, analyses will be organized into prespecified hypothesis families corresponding to H1a, H1b, and Aim 2. </w:t>
+      </w:r>
+      <w:r>
+        <w:t xml:space="preserve">Because the cognitive measures are expected to be intercorrelated, they will be treated as tests of the same hypothesis rather than independent tests, and a single cognitive outcome model will be estimated. Cortical thickness and cognitive outcomes, however, showed weak preliminary correlations and are therefore </w:t>
+      </w:r>
+      <w:r>
+        <w:t xml:space="preserve">will be </w:t>
+      </w:r>
+      <w:r>
+        <w:t>treated as independent.</w:t>
       </w:r>
     </w:p>
     <w:p>
       <w:pPr>
-        <w:spacing w:line="480" w:lineRule="auto"/>
-      </w:pPr>
-      <w:r>
-        <w:t>Statistical significance will be assessed using two-sided tests with a Bonferroni</w:t>
-      </w:r>
-      <w:r>
-        <w:t xml:space="preserve"> style</w:t>
-      </w:r>
-      <w:r>
-        <w:t>-adjusted significance level of α = 0.005 within each hypothesis family.</w:t>
+        <w:spacing w:after="0" w:line="480" w:lineRule="auto"/>
+      </w:pPr>
+      <w:r>
+        <w:t xml:space="preserve">Because preliminary results </w:t>
+      </w:r>
+      <w:r>
+        <w:t xml:space="preserve">also </w:t>
+      </w:r>
+      <w:r>
+        <w:t>showed strong correlation between inflammatory markers( IL-6 and MCP-1)</w:t>
+      </w:r>
+      <w:r>
+        <w:t>, the family-wise type I error rate will be controlled at two-sided α = 0.01</w:t>
+      </w:r>
+      <w:r>
+        <w:t>25</w:t>
+      </w:r>
+      <w:r>
+        <w:t xml:space="preserve"> (α = 0.05 / </w:t>
+      </w:r>
+      <w:r>
+        <w:t>4</w:t>
+      </w:r>
+      <w:r>
+        <w:t xml:space="preserve"> independent tests). If correlations among tests are weaker than anticipated, alpha will be further adjusted to reflect more independent tests.</w:t>
       </w:r>
     </w:p>
     <w:p>
       <w:pPr>
-        <w:spacing w:line="480" w:lineRule="auto"/>
+        <w:pStyle w:val="Heading3"/>
+        <w:spacing w:before="0" w:after="0" w:line="480" w:lineRule="auto"/>
       </w:pPr>
       <w:r>
         <w:lastRenderedPageBreak/>
-        <w:t>Because inflammatory markers and outcomes are expected to be correlated, results will be summarized by evaluating consistency in effect size and direction across related markers and outcomes rather than relying on isolated statistically significant findings.</w:t>
-      </w:r>
-    </w:p>
-    <w:p>
-      <w:pPr>
-        <w:pStyle w:val="Heading3"/>
-      </w:pPr>
-      <w:bookmarkStart w:id="16" w:name="_Toc224400999"/>
-      <w:r>
         <w:t>Details of the Analyses</w:t>
       </w:r>
       <w:bookmarkEnd w:id="16"/>
     </w:p>
     <w:p>
       <w:pPr>
-        <w:spacing w:line="480" w:lineRule="auto"/>
+        <w:pStyle w:val="p1"/>
+        <w:spacing w:before="0" w:beforeAutospacing="0" w:after="240" w:afterAutospacing="0" w:line="480" w:lineRule="auto"/>
+        <w:rPr>
+          <w:rFonts w:asciiTheme="minorHAnsi" w:eastAsiaTheme="minorHAnsi" w:hAnsiTheme="minorHAnsi" w:cstheme="minorBidi"/>
+          <w:kern w:val="2"/>
+          <w14:ligatures w14:val="standardContextual"/>
+        </w:rPr>
       </w:pPr>
       <w:bookmarkStart w:id="17" w:name="_Toc224401000"/>
       <w:r>
-        <w:t>Primary outcomes are one-year changes in cognitive performance and AD-signature cortical thickness (five outcomes total), with higher values indicating worsening cognition or cortical thinning.</w:t>
+        <w:rPr>
+          <w:rFonts w:asciiTheme="minorHAnsi" w:eastAsiaTheme="minorHAnsi" w:hAnsiTheme="minorHAnsi" w:cstheme="minorBidi"/>
+          <w:kern w:val="2"/>
+          <w14:ligatures w14:val="standardContextual"/>
+        </w:rPr>
+        <w:t>Primary outcomes include one-year changes in cognitive performance and AD-signature cortical thickness (five outcomes total). Primary exposures include circulating inflammatory markers measured at baseline and one-year follow-up. All models will adjust for age, sex, APOE genotype, baseline Clinical Dementia Rating (CDR), and baseline outcome value, consistent with variables collected in the parent RMADC studies.</w:t>
       </w:r>
     </w:p>
     <w:p>
       <w:pPr>
-        <w:spacing w:line="480" w:lineRule="auto"/>
-      </w:pPr>
-      <w:r>
-        <w:t>Primary exposures include circulating inflammatory markers measured in plasma at baseline and at one-year follow-up. All models will adjust for age, sex, APOE genotype, baseline Clinical Dementia Rating (CDR), and baseline outcome value. Additional health-related variables associated with inflammatory processes (e.g., BMI, cardiovascular risk factors, NSAID use, immune-related health conditions) will be evaluated as potential confounders in sensitivity analyses.</w:t>
+        <w:pStyle w:val="p1"/>
+        <w:spacing w:before="0" w:beforeAutospacing="0" w:after="240" w:afterAutospacing="0" w:line="480" w:lineRule="auto"/>
+        <w:rPr>
+          <w:rFonts w:asciiTheme="minorHAnsi" w:eastAsiaTheme="minorHAnsi" w:hAnsiTheme="minorHAnsi" w:cstheme="minorBidi"/>
+          <w:kern w:val="2"/>
+          <w14:ligatures w14:val="standardContextual"/>
+        </w:rPr>
+      </w:pPr>
+      <w:r>
+        <w:rPr>
+          <w:rFonts w:asciiTheme="minorHAnsi" w:eastAsiaTheme="minorHAnsi" w:hAnsiTheme="minorHAnsi" w:cstheme="minorBidi"/>
+          <w:kern w:val="2"/>
+          <w14:ligatures w14:val="standardContextual"/>
+        </w:rPr>
+        <w:t xml:space="preserve">For Hypothesis H1a, models will evaluate associations between baseline inflammatory markers and one-year outcome changes. For Hypothesis H1b, models will evaluate </w:t>
+      </w:r>
+      <w:r>
+        <w:rPr>
+          <w:rFonts w:asciiTheme="minorHAnsi" w:eastAsiaTheme="minorHAnsi" w:hAnsiTheme="minorHAnsi" w:cstheme="minorBidi"/>
+          <w:kern w:val="2"/>
+          <w14:ligatures w14:val="standardContextual"/>
+        </w:rPr>
+        <w:t>associations between changes in inflammatory markers and outcome changes.</w:t>
       </w:r>
     </w:p>
     <w:p>
       <w:pPr>
-        <w:spacing w:line="480" w:lineRule="auto"/>
-      </w:pPr>
-      <w:r>
-        <w:t>For Hypothesis H1a, linear regression models will evaluate associations between baseline inflammatory markers and one-year outcome changes. For Hypothesis H1b, models will evaluate whether one-year changes in inflammatory markers are associated with outcome changes.</w:t>
+        <w:pStyle w:val="p1"/>
+        <w:spacing w:before="0" w:beforeAutospacing="0" w:after="240" w:afterAutospacing="0" w:line="480" w:lineRule="auto"/>
+        <w:rPr>
+          <w:rFonts w:asciiTheme="minorHAnsi" w:eastAsiaTheme="minorHAnsi" w:hAnsiTheme="minorHAnsi" w:cstheme="minorBidi"/>
+          <w:kern w:val="2"/>
+          <w14:ligatures w14:val="standardContextual"/>
+        </w:rPr>
+      </w:pPr>
+      <w:r>
+        <w:rPr>
+          <w:rFonts w:asciiTheme="minorHAnsi" w:eastAsiaTheme="minorHAnsi" w:hAnsiTheme="minorHAnsi" w:cstheme="minorBidi"/>
+          <w:kern w:val="2"/>
+          <w14:ligatures w14:val="standardContextual"/>
+        </w:rPr>
+        <w:t xml:space="preserve">For Aim 2, models will include amyloid deposition and an inflammation </w:t>
+      </w:r>
+      <w:r>
+        <w:rPr>
+          <w:rFonts w:asciiTheme="minorHAnsi" w:eastAsiaTheme="minorHAnsi" w:hAnsiTheme="minorHAnsi" w:cstheme="minorBidi"/>
+          <w:kern w:val="2"/>
+          <w14:ligatures w14:val="standardContextual"/>
+        </w:rPr>
+        <w:t>x</w:t>
+      </w:r>
+      <w:r>
+        <w:rPr>
+          <w:rFonts w:asciiTheme="minorHAnsi" w:eastAsiaTheme="minorHAnsi" w:hAnsiTheme="minorHAnsi" w:cstheme="minorBidi"/>
+          <w:kern w:val="2"/>
+          <w14:ligatures w14:val="standardContextual"/>
+        </w:rPr>
+        <w:t xml:space="preserve"> amyloid interaction term. Amyloid will be dichotomized using an SUVR threshold of 1.10 (low vs high).</w:t>
       </w:r>
     </w:p>
     <w:p>
       <w:pPr>
-        <w:spacing w:line="480" w:lineRule="auto"/>
-      </w:pPr>
-      <w:r>
-        <w:t xml:space="preserve">For Aim 2, models will extend Aim 1 by including amyloid deposition and an inflammation </w:t>
-      </w:r>
-      <w:r>
-        <w:t>x</w:t>
-      </w:r>
-      <w:r>
-        <w:t xml:space="preserve"> amyloid interaction term to assess whether amyloid modifies the association between inflammation and the outcomes.</w:t>
+        <w:spacing w:after="240" w:line="480" w:lineRule="auto"/>
+      </w:pPr>
+      <w:r>
+        <w:t xml:space="preserve">Sensitivity analysis will be performed to test </w:t>
+      </w:r>
+      <w:r>
+        <w:t>whether covariates are potential</w:t>
+      </w:r>
+      <w:r>
+        <w:t xml:space="preserve"> confounders,</w:t>
+      </w:r>
+      <w:r>
+        <w:t xml:space="preserve"> </w:t>
+      </w:r>
+      <w:r>
+        <w:t xml:space="preserve">mediators, </w:t>
+      </w:r>
+      <w:r>
+        <w:t>or</w:t>
+      </w:r>
+      <w:r>
+        <w:t xml:space="preserve"> precision variables</w:t>
+      </w:r>
+      <w:r>
+        <w:t xml:space="preserve"> for each outcome</w:t>
+      </w:r>
+      <w:r>
+        <w:t>.</w:t>
       </w:r>
     </w:p>
     <w:p>
       <w:pPr>
-        <w:spacing w:line="480" w:lineRule="auto"/>
-        <w:rPr>
-          <w:noProof/>
-        </w:rPr>
-      </w:pPr>
-      <w:r>
-        <w:lastRenderedPageBreak/>
-        <w:t>Amyloid deposition will be dichotomized using an SUVR threshold of 1.10, which demonstrated 97% sensitivity and 100% specificity for amyloid positivity</w:t>
-      </w:r>
-      <w:r>
-        <w:t xml:space="preserve"> in previous analyses</w:t>
-      </w:r>
-      <w:r>
-        <w:t>. An indicator variable will therefore be coded as binary (low vs high amyloid).</w:t>
-      </w:r>
-      <w:r>
-        <w:rPr>
-          <w:noProof/>
-        </w:rPr>
-        <w:t xml:space="preserve"> </w:t>
-      </w:r>
-    </w:p>
-    <w:p>
-      <w:r>
-        <w:rPr>
-          <w:noProof/>
-        </w:rPr>
+        <w:spacing w:after="240" w:line="480" w:lineRule="auto"/>
+      </w:pPr>
+      <w:r>
         <w:drawing>
-          <wp:inline distT="0" distB="0" distL="0" distR="0" wp14:anchorId="5D0A93BF" wp14:editId="565D8071">
-            <wp:extent cx="5943600" cy="1979295"/>
-            <wp:effectExtent l="0" t="0" r="0" b="1905"/>
-            <wp:docPr id="1798628141" name="Picture 1" descr="A screenshot of a medical report&#10;&#10;AI-generated content may be incorrect."/>
+          <wp:inline distT="0" distB="0" distL="0" distR="0" wp14:anchorId="3A031EA5" wp14:editId="584ECC36">
+            <wp:extent cx="5943600" cy="1778000"/>
+            <wp:effectExtent l="12700" t="12700" r="12700" b="12700"/>
+            <wp:docPr id="1749861074" name="Picture 1"/>
             <wp:cNvGraphicFramePr>
               <a:graphicFrameLocks xmlns:a="http://schemas.openxmlformats.org/drawingml/2006/main" noChangeAspect="1"/>
             </wp:cNvGraphicFramePr>
@@ -716,7 +787,7 @@
               <a:graphicData uri="http://schemas.openxmlformats.org/drawingml/2006/picture">
                 <pic:pic xmlns:pic="http://schemas.openxmlformats.org/drawingml/2006/picture">
                   <pic:nvPicPr>
-                    <pic:cNvPr id="1798628141" name="Picture 1" descr="A screenshot of a medical report&#10;&#10;AI-generated content may be incorrect."/>
+                    <pic:cNvPr id="1749861074" name=""/>
                     <pic:cNvPicPr/>
                   </pic:nvPicPr>
                   <pic:blipFill>
@@ -728,11 +799,18 @@
                   <pic:spPr>
                     <a:xfrm>
                       <a:off x="0" y="0"/>
-                      <a:ext cx="5943600" cy="1979295"/>
+                      <a:ext cx="5943600" cy="1778000"/>
                     </a:xfrm>
                     <a:prstGeom prst="rect">
                       <a:avLst/>
                     </a:prstGeom>
+                    <a:ln>
+                      <a:solidFill>
+                        <a:schemeClr val="bg2">
+                          <a:lumMod val="75000"/>
+                        </a:schemeClr>
+                      </a:solidFill>
+                    </a:ln>
                   </pic:spPr>
                 </pic:pic>
               </a:graphicData>
@@ -744,104 +822,136 @@
     <w:p>
       <w:pPr>
         <w:pStyle w:val="Heading3"/>
-      </w:pPr>
-      <w:r>
+        <w:spacing w:before="0" w:after="0" w:line="480" w:lineRule="auto"/>
+      </w:pPr>
+      <w:r>
+        <w:lastRenderedPageBreak/>
         <w:t>Power Analysis</w:t>
       </w:r>
       <w:bookmarkEnd w:id="17"/>
     </w:p>
     <w:p>
       <w:pPr>
-        <w:spacing w:before="100" w:beforeAutospacing="1" w:after="100" w:afterAutospacing="1" w:line="480" w:lineRule="auto"/>
-      </w:pPr>
-      <w:r>
-        <w:t xml:space="preserve">Power calculations were conducted assuming a final analytic sample size of N = 175. </w:t>
+        <w:spacing w:line="480" w:lineRule="auto"/>
+      </w:pPr>
+      <w:r>
+        <w:t>Power calculations assumed a final analytic sample size of N = 175. For Aim 1, power was estimated using correlation-based methods (</w:t>
+      </w:r>
+      <w:proofErr w:type="spellStart"/>
+      <w:proofErr w:type="gramStart"/>
+      <w:r>
+        <w:t>powertools</w:t>
+      </w:r>
+      <w:proofErr w:type="spellEnd"/>
+      <w:r>
+        <w:t>::</w:t>
+      </w:r>
+      <w:proofErr w:type="gramEnd"/>
+      <w:r>
+        <w:t xml:space="preserve">corr.1samp in R) across a range of significance thresholds reflecting uncertainty in the effective number of </w:t>
+      </w:r>
+      <w:r>
+        <w:t xml:space="preserve"> independent </w:t>
+      </w:r>
+      <w:r>
+        <w:t>tests (α = 0.05/</w:t>
+      </w:r>
+      <w:r>
+        <w:t>4</w:t>
+      </w:r>
+      <w:r>
+        <w:t>, 0.05/10, 0.05/20). Minimum detectable correlations required to achieve 80% power were similar across thresholds (|r| ≈ 0.26–0.29;</w:t>
+      </w:r>
+      <w:r>
+        <w:t xml:space="preserve"> </w:t>
+      </w:r>
+      <w:r>
+        <w:fldChar w:fldCharType="begin"/>
+      </w:r>
+      <w:r>
+        <w:instrText xml:space="preserve"> REF _Ref225667126 \h </w:instrText>
+      </w:r>
+      <w:r>
+        <w:instrText xml:space="preserve"> \* MERGEFORMAT </w:instrText>
+      </w:r>
+      <w:r>
+        <w:fldChar w:fldCharType="separate"/>
+      </w:r>
+      <w:r>
+        <w:rPr>
+          <w:rFonts w:ascii="Times New Roman" w:hAnsi="Times New Roman" w:cs="Times New Roman"/>
+          <w:b/>
+          <w:bCs/>
+        </w:rPr>
+        <w:t>Ta</w:t>
+      </w:r>
+      <w:r>
+        <w:rPr>
+          <w:rFonts w:ascii="Times New Roman" w:hAnsi="Times New Roman" w:cs="Times New Roman"/>
+          <w:b/>
+          <w:bCs/>
+        </w:rPr>
+        <w:t>b</w:t>
+      </w:r>
+      <w:r>
+        <w:rPr>
+          <w:rFonts w:ascii="Times New Roman" w:hAnsi="Times New Roman" w:cs="Times New Roman"/>
+          <w:b/>
+          <w:bCs/>
+        </w:rPr>
+        <w:t xml:space="preserve">le </w:t>
+      </w:r>
+      <w:r>
+        <w:rPr>
+          <w:rFonts w:ascii="Times New Roman" w:hAnsi="Times New Roman" w:cs="Times New Roman"/>
+          <w:b/>
+          <w:bCs/>
+          <w:noProof/>
+        </w:rPr>
+        <w:t>1</w:t>
+      </w:r>
+      <w:r>
+        <w:fldChar w:fldCharType="end"/>
+      </w:r>
+      <w:r>
+        <w:t>), indicating</w:t>
+      </w:r>
+      <w:r>
+        <w:t xml:space="preserve"> </w:t>
+      </w:r>
+      <w:r>
+        <w:t>that the choice of alpha had little bearing on conclusions about adequacy of powe</w:t>
+      </w:r>
+      <w:r>
+        <w:t>r.</w:t>
       </w:r>
     </w:p>
     <w:p>
       <w:pPr>
-        <w:spacing w:before="100" w:beforeAutospacing="1" w:after="100" w:afterAutospacing="1" w:line="480" w:lineRule="auto"/>
-      </w:pPr>
-      <w:r>
-        <w:t xml:space="preserve">Because inflammatory markers are classified into two biologically related </w:t>
-      </w:r>
-      <w:r>
-        <w:t>groupings</w:t>
-      </w:r>
-      <w:r>
-        <w:t xml:space="preserve"> (cytokines and chemokines), and preliminary data indicated strong correlation between representative markers (IL-6 and MCP-1; ρ = 0.93, 95% CI: 0.86–0.97), analyses were treated as evaluating two correlated </w:t>
-      </w:r>
-      <w:r>
-        <w:t>group</w:t>
-      </w:r>
-      <w:r>
-        <w:t>s</w:t>
-      </w:r>
-      <w:r>
-        <w:t xml:space="preserve"> rather than four independent predictors.</w:t>
-      </w:r>
-    </w:p>
-    <w:p>
-      <w:pPr>
-        <w:spacing w:before="100" w:beforeAutospacing="1" w:after="100" w:afterAutospacing="1" w:line="480" w:lineRule="auto"/>
-      </w:pPr>
-      <w:r>
-        <w:t xml:space="preserve">Accordingly, </w:t>
-      </w:r>
-      <w:r>
-        <w:t>multiple testing</w:t>
-      </w:r>
-      <w:r>
-        <w:t xml:space="preserve"> within each hypothesis was defined across five outcomes and </w:t>
-      </w:r>
-      <w:r>
-        <w:t>the two</w:t>
-      </w:r>
-      <w:r>
-        <w:t xml:space="preserve"> inflammatory </w:t>
-      </w:r>
-      <w:r>
-        <w:t>groups</w:t>
-      </w:r>
-      <w:r>
-        <w:t xml:space="preserve"> (</w:t>
-      </w:r>
-      <w:r>
-        <w:t xml:space="preserve">5 outcomes x 2 markers = </w:t>
-      </w:r>
-      <w:r>
-        <w:t>10 tests), and power calculations used a Bonferroni</w:t>
-      </w:r>
-      <w:r>
-        <w:t xml:space="preserve"> style</w:t>
-      </w:r>
-      <w:r>
-        <w:t xml:space="preserve">-adjusted two-sided α = 0.005 (0.05/10), with α = 0.0025 </w:t>
-      </w:r>
-      <w:r>
-        <w:t xml:space="preserve">(0.05/20) </w:t>
-      </w:r>
-      <w:r>
-        <w:t>evaluated as a conservative sensitivity analysis</w:t>
-      </w:r>
-      <w:r>
-        <w:t xml:space="preserve"> on the full Bonferroni-adjusted alpha</w:t>
-      </w:r>
-      <w:r>
-        <w:t>.</w:t>
-      </w:r>
-    </w:p>
-    <w:p>
-      <w:r>
-        <w:rPr>
-          <w:noProof/>
-        </w:rPr>
-        <w:lastRenderedPageBreak/>
+        <w:jc w:val="center"/>
+        <w:rPr>
+          <w:b/>
+          <w:bCs/>
+          <w:i/>
+          <w:iCs/>
+          <w:sz w:val="21"/>
+          <w:szCs w:val="21"/>
+        </w:rPr>
+      </w:pPr>
+      <w:r>
+        <w:rPr>
+          <w:b/>
+          <w:bCs/>
+          <w:i/>
+          <w:iCs/>
+          <w:sz w:val="21"/>
+          <w:szCs w:val="21"/>
+        </w:rPr>
         <w:drawing>
-          <wp:inline distT="0" distB="0" distL="0" distR="0" wp14:anchorId="314717BE" wp14:editId="0F66A6AC">
-            <wp:extent cx="5943600" cy="3826510"/>
-            <wp:effectExtent l="0" t="0" r="0" b="0"/>
-            <wp:docPr id="674217966" name="Picture 1"/>
+          <wp:inline distT="0" distB="0" distL="0" distR="0" wp14:anchorId="4C70FEDB" wp14:editId="25EE0628">
+            <wp:extent cx="4977517" cy="2614260"/>
+            <wp:effectExtent l="0" t="0" r="1270" b="2540"/>
+            <wp:docPr id="853240025" name="Picture 1"/>
             <wp:cNvGraphicFramePr>
               <a:graphicFrameLocks xmlns:a="http://schemas.openxmlformats.org/drawingml/2006/main" noChangeAspect="1"/>
             </wp:cNvGraphicFramePr>
@@ -849,7 +959,7 @@
               <a:graphicData uri="http://schemas.openxmlformats.org/drawingml/2006/picture">
                 <pic:pic xmlns:pic="http://schemas.openxmlformats.org/drawingml/2006/picture">
                   <pic:nvPicPr>
-                    <pic:cNvPr id="674217966" name=""/>
+                    <pic:cNvPr id="853240025" name=""/>
                     <pic:cNvPicPr/>
                   </pic:nvPicPr>
                   <pic:blipFill>
@@ -861,7 +971,7 @@
                   <pic:spPr>
                     <a:xfrm>
                       <a:off x="0" y="0"/>
-                      <a:ext cx="5943600" cy="3826510"/>
+                      <a:ext cx="5042764" cy="2648529"/>
                     </a:xfrm>
                     <a:prstGeom prst="rect">
                       <a:avLst/>
@@ -873,7 +983,223 @@
           </wp:inline>
         </w:drawing>
       </w:r>
-      <w:r>
+    </w:p>
+    <w:p>
+      <w:pPr>
+        <w:pStyle w:val="Caption"/>
+        <w:rPr>
+          <w:rFonts w:ascii="Times New Roman" w:hAnsi="Times New Roman" w:cs="Times New Roman"/>
+          <w:sz w:val="21"/>
+          <w:szCs w:val="21"/>
+        </w:rPr>
+      </w:pPr>
+      <w:bookmarkStart w:id="18" w:name="_Ref225667126"/>
+      <w:r>
+        <w:rPr>
+          <w:rFonts w:ascii="Times New Roman" w:hAnsi="Times New Roman" w:cs="Times New Roman"/>
+          <w:b/>
+          <w:bCs/>
+          <w:sz w:val="21"/>
+          <w:szCs w:val="21"/>
+        </w:rPr>
+        <w:t xml:space="preserve">Table </w:t>
+      </w:r>
+      <w:r>
+        <w:rPr>
+          <w:rFonts w:ascii="Times New Roman" w:hAnsi="Times New Roman" w:cs="Times New Roman"/>
+          <w:b/>
+          <w:bCs/>
+          <w:sz w:val="21"/>
+          <w:szCs w:val="21"/>
+        </w:rPr>
+        <w:fldChar w:fldCharType="begin"/>
+      </w:r>
+      <w:r>
+        <w:rPr>
+          <w:rFonts w:ascii="Times New Roman" w:hAnsi="Times New Roman" w:cs="Times New Roman"/>
+          <w:b/>
+          <w:bCs/>
+          <w:sz w:val="21"/>
+          <w:szCs w:val="21"/>
+        </w:rPr>
+        <w:instrText xml:space="preserve"> SEQ Table \* ARABIC </w:instrText>
+      </w:r>
+      <w:r>
+        <w:rPr>
+          <w:rFonts w:ascii="Times New Roman" w:hAnsi="Times New Roman" w:cs="Times New Roman"/>
+          <w:b/>
+          <w:bCs/>
+          <w:sz w:val="21"/>
+          <w:szCs w:val="21"/>
+        </w:rPr>
+        <w:fldChar w:fldCharType="separate"/>
+      </w:r>
+      <w:r>
+        <w:rPr>
+          <w:rFonts w:ascii="Times New Roman" w:hAnsi="Times New Roman" w:cs="Times New Roman"/>
+          <w:b/>
+          <w:bCs/>
+          <w:noProof/>
+          <w:sz w:val="21"/>
+          <w:szCs w:val="21"/>
+        </w:rPr>
+        <w:t>1</w:t>
+      </w:r>
+      <w:r>
+        <w:rPr>
+          <w:rFonts w:ascii="Times New Roman" w:hAnsi="Times New Roman" w:cs="Times New Roman"/>
+          <w:b/>
+          <w:bCs/>
+          <w:sz w:val="21"/>
+          <w:szCs w:val="21"/>
+        </w:rPr>
+        <w:fldChar w:fldCharType="end"/>
+      </w:r>
+      <w:bookmarkEnd w:id="18"/>
+      <w:r>
+        <w:rPr>
+          <w:rFonts w:ascii="Times New Roman" w:hAnsi="Times New Roman" w:cs="Times New Roman"/>
+          <w:b/>
+          <w:bCs/>
+          <w:sz w:val="21"/>
+          <w:szCs w:val="21"/>
+        </w:rPr>
+        <w:t xml:space="preserve">. Aim 1 Power Calculations at N = 175. </w:t>
+      </w:r>
+      <w:r>
+        <w:rPr>
+          <w:rFonts w:ascii="Times New Roman" w:hAnsi="Times New Roman" w:cs="Times New Roman"/>
+          <w:sz w:val="21"/>
+          <w:szCs w:val="21"/>
+        </w:rPr>
+        <w:t xml:space="preserve">Estimated statistical power (%) to detect correlations between inflammatory markers and outcome changes across a range of assumed effect sizes and significance thresholds reflecting different multiplicity assumptions (α = 0.05/4, 0.05/10, 0.05/20). </w:t>
+      </w:r>
+    </w:p>
+    <w:p/>
+    <w:p>
+      <w:pPr>
+        <w:spacing w:line="480" w:lineRule="auto"/>
+      </w:pPr>
+      <w:r>
+        <w:t xml:space="preserve">Accordingly, </w:t>
+      </w:r>
+      <w:proofErr w:type="gramStart"/>
+      <w:r>
+        <w:t>Aim</w:t>
+      </w:r>
+      <w:proofErr w:type="gramEnd"/>
+      <w:r>
+        <w:t xml:space="preserve"> 2 power analyses were conducted at α = 0.01. Power was estimated using two-sample correlation methods (</w:t>
+      </w:r>
+      <w:proofErr w:type="spellStart"/>
+      <w:proofErr w:type="gramStart"/>
+      <w:r>
+        <w:t>powertools</w:t>
+      </w:r>
+      <w:proofErr w:type="spellEnd"/>
+      <w:r>
+        <w:t>::</w:t>
+      </w:r>
+      <w:proofErr w:type="gramEnd"/>
+      <w:r>
+        <w:t xml:space="preserve">corr.2samp in R), comparing associations between inflammation and outcomes across amyloid-negative and amyloid-positive groups. Power was evaluated across plausible ranges of correlations and group size distributions. </w:t>
+      </w:r>
+      <w:r>
+        <w:t>Results (</w:t>
+      </w:r>
+      <w:r>
+        <w:fldChar w:fldCharType="begin"/>
+      </w:r>
+      <w:r>
+        <w:instrText xml:space="preserve"> REF _Ref225667303 \h </w:instrText>
+      </w:r>
+      <w:r>
+        <w:instrText xml:space="preserve"> \* MERGEFORMAT </w:instrText>
+      </w:r>
+      <w:r>
+        <w:fldChar w:fldCharType="separate"/>
+      </w:r>
+      <w:r>
+        <w:rPr>
+          <w:rFonts w:ascii="Times New Roman" w:hAnsi="Times New Roman" w:cs="Times New Roman"/>
+          <w:b/>
+          <w:bCs/>
+        </w:rPr>
+        <w:t>Figur</w:t>
+      </w:r>
+      <w:r>
+        <w:rPr>
+          <w:rFonts w:ascii="Times New Roman" w:hAnsi="Times New Roman" w:cs="Times New Roman"/>
+          <w:b/>
+          <w:bCs/>
+        </w:rPr>
+        <w:t>e</w:t>
+      </w:r>
+      <w:r>
+        <w:rPr>
+          <w:rFonts w:ascii="Times New Roman" w:hAnsi="Times New Roman" w:cs="Times New Roman"/>
+          <w:b/>
+          <w:bCs/>
+        </w:rPr>
+        <w:t xml:space="preserve"> </w:t>
+      </w:r>
+      <w:r>
+        <w:rPr>
+          <w:rFonts w:ascii="Times New Roman" w:hAnsi="Times New Roman" w:cs="Times New Roman"/>
+          <w:b/>
+          <w:bCs/>
+          <w:noProof/>
+        </w:rPr>
+        <w:t>1</w:t>
+      </w:r>
+      <w:r>
+        <w:fldChar w:fldCharType="end"/>
+      </w:r>
+      <w:r>
+        <w:t>) indicated</w:t>
+      </w:r>
+      <w:r>
+        <w:t xml:space="preserve"> that power </w:t>
+      </w:r>
+      <w:r>
+        <w:t xml:space="preserve">was </w:t>
+      </w:r>
+      <w:r>
+        <w:t xml:space="preserve">driven primarily by differences in </w:t>
+      </w:r>
+      <w:r>
+        <w:lastRenderedPageBreak/>
+        <w:t xml:space="preserve">correlations between groups rather than </w:t>
+      </w:r>
+      <w:r>
+        <w:t>differences in group sizes</w:t>
+      </w:r>
+      <w:r>
+        <w:t xml:space="preserve">. </w:t>
+      </w:r>
+      <w:r>
+        <w:t>C</w:t>
+      </w:r>
+      <w:r>
+        <w:t>orrelations in the amyloid-positive group of approximately r ≈ 0.5</w:t>
+      </w:r>
+      <w:r>
+        <w:t>5</w:t>
+      </w:r>
+      <w:r>
+        <w:t xml:space="preserve">–0.70 were required to achieve 80% power, depending on the correlation </w:t>
+      </w:r>
+      <w:r>
+        <w:t>and size differences between the amyloid groups</w:t>
+      </w:r>
+      <w:r>
+        <w:t>.</w:t>
+      </w:r>
+    </w:p>
+    <w:p>
+      <w:pPr>
+        <w:spacing w:line="240" w:lineRule="auto"/>
+        <w:jc w:val="center"/>
         <w:rPr>
           <w:rFonts w:ascii="Times New Roman" w:hAnsi="Times New Roman" w:cs="Times New Roman"/>
           <w:b/>
@@ -883,81 +1209,23 @@
           <w:sz w:val="21"/>
           <w:szCs w:val="21"/>
         </w:rPr>
-        <w:t xml:space="preserve">Figure 1. Power to detect associations between inflammatory markers and outcomes at N = 175. </w:t>
-      </w:r>
+      </w:pPr>
+      <w:bookmarkStart w:id="19" w:name="_Ref225667303"/>
       <w:r>
         <w:rPr>
           <w:rFonts w:ascii="Times New Roman" w:hAnsi="Times New Roman" w:cs="Times New Roman"/>
+          <w:b/>
+          <w:bCs/>
           <w:i/>
           <w:iCs/>
           <w:sz w:val="21"/>
           <w:szCs w:val="21"/>
         </w:rPr>
-        <w:t xml:space="preserve">Power curves illustrate the estimated power to detect associations between inflammatory markers (IL-6 and MCP-1) and one-year changes in cognitive performance (CVLTΔ) and AD-signature cortical thickness (CORTΔ), evaluated across a range of plausible correlations informed by preliminary data (±0.30 around pilot estimates). The dashed horizontal line represents 80% power, and vertical dotted lines indicate the minimum detectable correlation for each outcome and α level. </w:t>
-      </w:r>
-    </w:p>
-    <w:p>
-      <w:pPr>
-        <w:spacing w:before="100" w:beforeAutospacing="1" w:after="100" w:afterAutospacing="1" w:line="480" w:lineRule="auto"/>
-      </w:pPr>
-      <w:r>
-        <w:t>For Aim 1, although final analyses will use covariate-adjusted linear regression, power was approximated using correlation-based methods (</w:t>
-      </w:r>
-      <w:proofErr w:type="spellStart"/>
-      <w:proofErr w:type="gramStart"/>
-      <w:r>
-        <w:t>powertools</w:t>
-      </w:r>
-      <w:proofErr w:type="spellEnd"/>
-      <w:r>
-        <w:t>::</w:t>
-      </w:r>
-      <w:proofErr w:type="gramEnd"/>
-      <w:r>
-        <w:t xml:space="preserve">corr.1samp in R). Effect sizes were based on preliminary correlations between IL-6, MCP-1, and change outcomes (CVLT and AD-signature cortical thickness), and power was evaluated across ranges defined as ±0.30 around each </w:t>
-      </w:r>
-      <w:r>
-        <w:t xml:space="preserve">correlation </w:t>
-      </w:r>
-      <w:r>
-        <w:t>estimate.</w:t>
-      </w:r>
-    </w:p>
-    <w:p>
-      <w:pPr>
-        <w:spacing w:before="100" w:beforeAutospacing="1" w:after="100" w:afterAutospacing="1" w:line="240" w:lineRule="auto"/>
-        <w:jc w:val="center"/>
-        <w:rPr>
-          <w:rFonts w:ascii="Times New Roman" w:eastAsia="Times New Roman" w:hAnsi="Times New Roman" w:cs="Times New Roman"/>
-          <w:b/>
-          <w:bCs/>
-          <w:i/>
-          <w:iCs/>
-          <w:kern w:val="0"/>
-          <w:sz w:val="21"/>
-          <w:szCs w:val="21"/>
-          <w14:ligatures w14:val="none"/>
-        </w:rPr>
-      </w:pPr>
-      <w:r>
-        <w:rPr>
-          <w:rFonts w:ascii="Times New Roman" w:eastAsia="Times New Roman" w:hAnsi="Times New Roman" w:cs="Times New Roman"/>
-          <w:b/>
-          <w:bCs/>
-          <w:i/>
-          <w:iCs/>
-          <w:noProof/>
-          <w:kern w:val="0"/>
-          <w:sz w:val="21"/>
-          <w:szCs w:val="21"/>
-          <w14:ligatures w14:val="none"/>
-        </w:rPr>
-        <w:lastRenderedPageBreak/>
         <w:drawing>
-          <wp:inline distT="0" distB="0" distL="0" distR="0" wp14:anchorId="7F61CD1D" wp14:editId="6C61D247">
-            <wp:extent cx="5359677" cy="3904090"/>
-            <wp:effectExtent l="0" t="0" r="0" b="0"/>
-            <wp:docPr id="1883880585" name="Picture 1"/>
+          <wp:inline distT="0" distB="0" distL="0" distR="0" wp14:anchorId="6AC9FBBF" wp14:editId="23548F2B">
+            <wp:extent cx="5669435" cy="3935896"/>
+            <wp:effectExtent l="0" t="0" r="0" b="1270"/>
+            <wp:docPr id="1402970270" name="Picture 1"/>
             <wp:cNvGraphicFramePr>
               <a:graphicFrameLocks xmlns:a="http://schemas.openxmlformats.org/drawingml/2006/main" noChangeAspect="1"/>
             </wp:cNvGraphicFramePr>
@@ -965,7 +1233,7 @@
               <a:graphicData uri="http://schemas.openxmlformats.org/drawingml/2006/picture">
                 <pic:pic xmlns:pic="http://schemas.openxmlformats.org/drawingml/2006/picture">
                   <pic:nvPicPr>
-                    <pic:cNvPr id="1883880585" name=""/>
+                    <pic:cNvPr id="1402970270" name=""/>
                     <pic:cNvPicPr/>
                   </pic:nvPicPr>
                   <pic:blipFill>
@@ -977,7 +1245,7 @@
                   <pic:spPr>
                     <a:xfrm>
                       <a:off x="0" y="0"/>
-                      <a:ext cx="5435154" cy="3959069"/>
+                      <a:ext cx="5688605" cy="3949205"/>
                     </a:xfrm>
                     <a:prstGeom prst="rect">
                       <a:avLst/>
@@ -992,115 +1260,197 @@
     </w:p>
     <w:p>
       <w:pPr>
-        <w:spacing w:before="100" w:beforeAutospacing="1" w:after="100" w:afterAutospacing="1" w:line="240" w:lineRule="auto"/>
-        <w:rPr>
-          <w:rFonts w:ascii="Times New Roman" w:eastAsia="Times New Roman" w:hAnsi="Times New Roman" w:cs="Times New Roman"/>
+        <w:spacing w:line="240" w:lineRule="auto"/>
+        <w:rPr>
+          <w:rFonts w:ascii="Times New Roman" w:hAnsi="Times New Roman" w:cs="Times New Roman"/>
           <w:i/>
           <w:iCs/>
-          <w:kern w:val="0"/>
           <w:sz w:val="21"/>
           <w:szCs w:val="21"/>
-          <w14:ligatures w14:val="none"/>
-        </w:rPr>
-      </w:pPr>
-      <w:r>
-        <w:rPr>
-          <w:rFonts w:ascii="Times New Roman" w:eastAsia="Times New Roman" w:hAnsi="Times New Roman" w:cs="Times New Roman"/>
+        </w:rPr>
+      </w:pPr>
+      <w:r>
+        <w:rPr>
+          <w:rFonts w:ascii="Times New Roman" w:hAnsi="Times New Roman" w:cs="Times New Roman"/>
           <w:b/>
           <w:bCs/>
           <w:i/>
           <w:iCs/>
-          <w:kern w:val="0"/>
           <w:sz w:val="21"/>
           <w:szCs w:val="21"/>
-          <w14:ligatures w14:val="none"/>
-        </w:rPr>
-        <w:t xml:space="preserve">Figure 2. </w:t>
-      </w:r>
-      <w:r>
-        <w:rPr>
-          <w:rFonts w:ascii="Times New Roman" w:eastAsia="Times New Roman" w:hAnsi="Times New Roman" w:cs="Times New Roman"/>
+        </w:rPr>
+        <w:t xml:space="preserve">Figure </w:t>
+      </w:r>
+      <w:r>
+        <w:rPr>
+          <w:rFonts w:ascii="Times New Roman" w:hAnsi="Times New Roman" w:cs="Times New Roman"/>
           <w:b/>
           <w:bCs/>
           <w:i/>
           <w:iCs/>
-          <w:kern w:val="0"/>
           <w:sz w:val="21"/>
           <w:szCs w:val="21"/>
-          <w14:ligatures w14:val="none"/>
-        </w:rPr>
-        <w:t>Power to detect the inflammation × amyloid interaction at N = 175.</w:t>
-      </w:r>
-      <w:r>
-        <w:rPr>
-          <w:rFonts w:ascii="Times New Roman" w:eastAsia="Times New Roman" w:hAnsi="Times New Roman" w:cs="Times New Roman"/>
+        </w:rPr>
+        <w:fldChar w:fldCharType="begin"/>
+      </w:r>
+      <w:r>
+        <w:rPr>
+          <w:rFonts w:ascii="Times New Roman" w:hAnsi="Times New Roman" w:cs="Times New Roman"/>
+          <w:b/>
+          <w:bCs/>
           <w:i/>
           <w:iCs/>
-          <w:kern w:val="0"/>
           <w:sz w:val="21"/>
           <w:szCs w:val="21"/>
-          <w14:ligatures w14:val="none"/>
-        </w:rPr>
-        <w:t xml:space="preserve"> </w:t>
-      </w:r>
-      <w:r>
-        <w:rPr>
-          <w:rFonts w:ascii="Times New Roman" w:eastAsia="Times New Roman" w:hAnsi="Times New Roman" w:cs="Times New Roman"/>
+        </w:rPr>
+        <w:instrText xml:space="preserve"> SEQ Figure \* ARABIC </w:instrText>
+      </w:r>
+      <w:r>
+        <w:rPr>
+          <w:rFonts w:ascii="Times New Roman" w:hAnsi="Times New Roman" w:cs="Times New Roman"/>
+          <w:b/>
+          <w:bCs/>
           <w:i/>
           <w:iCs/>
-          <w:kern w:val="0"/>
           <w:sz w:val="21"/>
           <w:szCs w:val="21"/>
-          <w14:ligatures w14:val="none"/>
-        </w:rPr>
-        <w:t xml:space="preserve">Power curves display the estimated power to detect the interaction between peripheral inflammation and amyloid deposition as a function of the assumed partial correlation for the interaction term. Negative values are shown to reflect the hypothesized direction of association (greater inflammation and amyloid associated with worse outcomes). The dashed horizontal line represents 80% power, and vertical dotted lines indicate the minimum detectable interaction effect size at each α level. </w:t>
+        </w:rPr>
+        <w:fldChar w:fldCharType="separate"/>
+      </w:r>
+      <w:r>
+        <w:rPr>
+          <w:rFonts w:ascii="Times New Roman" w:hAnsi="Times New Roman" w:cs="Times New Roman"/>
+          <w:b/>
+          <w:bCs/>
+          <w:i/>
+          <w:iCs/>
+          <w:noProof/>
+          <w:sz w:val="21"/>
+          <w:szCs w:val="21"/>
+        </w:rPr>
+        <w:t>1</w:t>
+      </w:r>
+      <w:r>
+        <w:rPr>
+          <w:rFonts w:ascii="Times New Roman" w:hAnsi="Times New Roman" w:cs="Times New Roman"/>
+          <w:b/>
+          <w:bCs/>
+          <w:i/>
+          <w:iCs/>
+          <w:sz w:val="21"/>
+          <w:szCs w:val="21"/>
+        </w:rPr>
+        <w:fldChar w:fldCharType="end"/>
+      </w:r>
+      <w:bookmarkEnd w:id="19"/>
+      <w:r>
+        <w:rPr>
+          <w:rFonts w:ascii="Times New Roman" w:hAnsi="Times New Roman" w:cs="Times New Roman"/>
+          <w:b/>
+          <w:bCs/>
+          <w:i/>
+          <w:iCs/>
+          <w:sz w:val="21"/>
+          <w:szCs w:val="21"/>
+        </w:rPr>
+        <w:t>. Aim 2 Power for Interaction Effects at N = 175.</w:t>
+      </w:r>
+      <w:r>
+        <w:rPr>
+          <w:rFonts w:ascii="Times New Roman" w:hAnsi="Times New Roman" w:cs="Times New Roman"/>
+          <w:b/>
+          <w:bCs/>
+          <w:i/>
+          <w:iCs/>
+          <w:sz w:val="21"/>
+          <w:szCs w:val="21"/>
+        </w:rPr>
+        <w:t xml:space="preserve"> </w:t>
+      </w:r>
+      <w:r>
+        <w:rPr>
+          <w:rFonts w:ascii="Times New Roman" w:hAnsi="Times New Roman" w:cs="Times New Roman"/>
+          <w:i/>
+          <w:iCs/>
+          <w:sz w:val="21"/>
+          <w:szCs w:val="21"/>
+        </w:rPr>
+        <w:t>Power curves illustrate the ability to detect differences in correlations between amyloid-negative and amyloid-positive groups at α = 0.01</w:t>
+      </w:r>
+      <w:r>
+        <w:rPr>
+          <w:rFonts w:ascii="Times New Roman" w:hAnsi="Times New Roman" w:cs="Times New Roman"/>
+          <w:i/>
+          <w:iCs/>
+          <w:sz w:val="21"/>
+          <w:szCs w:val="21"/>
+        </w:rPr>
+        <w:t>25</w:t>
+      </w:r>
+      <w:r>
+        <w:rPr>
+          <w:rFonts w:ascii="Times New Roman" w:hAnsi="Times New Roman" w:cs="Times New Roman"/>
+          <w:i/>
+          <w:iCs/>
+          <w:sz w:val="21"/>
+          <w:szCs w:val="21"/>
+        </w:rPr>
+        <w:t xml:space="preserve">. Panels correspond to increasing correlations in the amyloid-negative group (r = 0.1, 0.2, 0.3), while curves represent varying sample sizes in the amyloid-positive group. </w:t>
       </w:r>
     </w:p>
     <w:p>
       <w:pPr>
-        <w:spacing w:before="100" w:beforeAutospacing="1" w:after="100" w:afterAutospacing="1" w:line="480" w:lineRule="auto"/>
-      </w:pPr>
-      <w:r>
-        <w:t xml:space="preserve">For Aim 2, because pilot data did not include amyloid deposition, power was evaluated across a plausible range of partial correlations using </w:t>
-      </w:r>
-      <w:proofErr w:type="spellStart"/>
-      <w:proofErr w:type="gramStart"/>
-      <w:r>
-        <w:t>powertools</w:t>
-      </w:r>
-      <w:proofErr w:type="spellEnd"/>
-      <w:r>
-        <w:t>::</w:t>
-      </w:r>
-      <w:proofErr w:type="spellStart"/>
-      <w:proofErr w:type="gramEnd"/>
-      <w:r>
-        <w:t>mlrF.partial</w:t>
-      </w:r>
-      <w:proofErr w:type="spellEnd"/>
-      <w:r>
-        <w:t xml:space="preserve"> in R. </w:t>
-      </w:r>
-      <w:r>
-        <w:t>We assumed t</w:t>
-      </w:r>
-      <w:r>
-        <w:t>he reduced model included six predictors (covariates plus inflammation and amyloid; p = 6), and the full model included the interaction term (q = 1).</w:t>
-      </w:r>
+        <w:spacing w:line="240" w:lineRule="auto"/>
+      </w:pPr>
     </w:p>
     <w:p>
       <w:pPr>
-        <w:spacing w:before="100" w:beforeAutospacing="1" w:after="100" w:afterAutospacing="1" w:line="480" w:lineRule="auto"/>
-      </w:pPr>
-      <w:r>
-        <w:t xml:space="preserve">Power results (Figures 1–2) indicate that correlations of approximately |r| ≈ 0.28–0.39 are required to achieve 80% power for Aim 1, and partial correlations of approximately 0.27–0.29 for Aim 2, depending on </w:t>
-      </w:r>
-      <w:r>
-        <w:t>alpha</w:t>
-      </w:r>
-      <w:r>
-        <w:t>. These results suggest the proposed sample size is sufficient to detect moderate effects but may be underpowered for small effects.</w:t>
-      </w:r>
+        <w:spacing w:line="480" w:lineRule="auto"/>
+      </w:pPr>
+      <w:r>
+        <w:t>These results indicate that the proposed sample size</w:t>
+      </w:r>
+      <w:r>
+        <w:t xml:space="preserve"> of </w:t>
+      </w:r>
+      <w:r>
+        <w:t>N=175</w:t>
+      </w:r>
+      <w:r>
+        <w:t xml:space="preserve"> </w:t>
+      </w:r>
+      <w:r>
+        <w:t>provides adequate power to</w:t>
+      </w:r>
+      <w:r>
+        <w:t xml:space="preserve"> </w:t>
+      </w:r>
+      <w:r>
+        <w:t xml:space="preserve">detect moderate associations in Aim 1 and moderate-to-large interaction effects in Aim </w:t>
+      </w:r>
+      <w:r>
+        <w:t>2</w:t>
+      </w:r>
+      <w:r>
+        <w:t>.</w:t>
+      </w:r>
+      <w:r>
+        <w:t xml:space="preserve"> </w:t>
+      </w:r>
+      <w:r>
+        <w:t xml:space="preserve">Given that interaction effects are often smaller than main effects, the study </w:t>
+      </w:r>
+      <w:r>
+        <w:t>will be</w:t>
+      </w:r>
+      <w:r>
+        <w:t xml:space="preserve"> underpowered to detect small interaction effects.</w:t>
+      </w:r>
+    </w:p>
+    <w:p>
+      <w:pPr>
+        <w:spacing w:line="480" w:lineRule="auto"/>
+      </w:pPr>
     </w:p>
     <w:sectPr>
       <w:pgSz w:w="12240" w:h="15840"/>
@@ -3432,7 +3782,6 @@
   <w:style w:type="character" w:default="1" w:styleId="DefaultParagraphFont">
     <w:name w:val="Default Paragraph Font"/>
     <w:uiPriority w:val="1"/>
-    <w:semiHidden/>
     <w:unhideWhenUsed/>
   </w:style>
   <w:style w:type="table" w:default="1" w:styleId="TableNormal">

</xml_diff>

<commit_message>
minor edits to code and added reproducibility section in report.
</commit_message>
<xml_diff>
--- a/Project2/Reports/Project2_Final_Analysis_Plan.docx
+++ b/Project2/Reports/Project2_Final_Analysis_Plan.docx
@@ -1445,6 +1445,48 @@
       </w:r>
       <w:r>
         <w:t xml:space="preserve"> underpowered to detect small interaction effects.</w:t>
+      </w:r>
+    </w:p>
+    <w:p>
+      <w:pPr>
+        <w:spacing w:line="480" w:lineRule="auto"/>
+      </w:pPr>
+    </w:p>
+    <w:p>
+      <w:pPr>
+        <w:pStyle w:val="Heading2"/>
+      </w:pPr>
+      <w:bookmarkStart w:id="20" w:name="_Toc221022978"/>
+      <w:r>
+        <w:lastRenderedPageBreak/>
+        <w:t>Reproducibility Statement</w:t>
+      </w:r>
+      <w:bookmarkEnd w:id="20"/>
+    </w:p>
+    <w:p>
+      <w:r>
+        <w:t xml:space="preserve">The statistical code used in this analysis is available on my GitHub under the Code directory at: </w:t>
+      </w:r>
+      <w:hyperlink r:id="rId9" w:history="1">
+        <w:r>
+          <w:rPr>
+            <w:rStyle w:val="Hyperlink"/>
+          </w:rPr>
+          <w:t>https://github.com/rysummers/BIOS6624-Class/tree/main/Project2</w:t>
+        </w:r>
+      </w:hyperlink>
+    </w:p>
+    <w:p>
+      <w:r>
+        <w:t>Raw data are not tracked in this repository and is available upon request.</w:t>
+      </w:r>
+    </w:p>
+    <w:p>
+      <w:r>
+        <w:t xml:space="preserve">Link to data on local drive: </w:t>
+      </w:r>
+      <w:r>
+        <w:t>/Users/ryan_summers/GitHub/BIOS6624-Class/Project2/DataRaw/PrelimData.csv</w:t>
       </w:r>
     </w:p>
     <w:p>

</xml_diff>

<commit_message>
noticed typos in report. updated alpha adjustment values used.
</commit_message>
<xml_diff>
--- a/Project2/Reports/Project2_Final_Analysis_Plan.docx
+++ b/Project2/Reports/Project2_Final_Analysis_Plan.docx
@@ -775,6 +775,9 @@
         <w:spacing w:after="240" w:line="480" w:lineRule="auto"/>
       </w:pPr>
       <w:r>
+        <w:rPr>
+          <w:noProof/>
+        </w:rPr>
         <w:drawing>
           <wp:inline distT="0" distB="0" distL="0" distR="0" wp14:anchorId="3A031EA5" wp14:editId="584ECC36">
             <wp:extent cx="5943600" cy="1778000"/>
@@ -860,7 +863,13 @@
         <w:t>4</w:t>
       </w:r>
       <w:r>
-        <w:t>, 0.05/10, 0.05/20). Minimum detectable correlations required to achieve 80% power were similar across thresholds (|r| ≈ 0.26–0.29;</w:t>
+        <w:t>, 0.05/10, 0.05/20). Minimum detectable correlations required to achieve 80% power were similar across thresholds (|r| ≈ 0.2</w:t>
+      </w:r>
+      <w:r>
+        <w:t>5</w:t>
+      </w:r>
+      <w:r>
+        <w:t>–0.29;</w:t>
       </w:r>
       <w:r>
         <w:t xml:space="preserve"> </w:t>
@@ -883,23 +892,7 @@
           <w:b/>
           <w:bCs/>
         </w:rPr>
-        <w:t>Ta</w:t>
-      </w:r>
-      <w:r>
-        <w:rPr>
-          <w:rFonts w:ascii="Times New Roman" w:hAnsi="Times New Roman" w:cs="Times New Roman"/>
-          <w:b/>
-          <w:bCs/>
-        </w:rPr>
-        <w:t>b</w:t>
-      </w:r>
-      <w:r>
-        <w:rPr>
-          <w:rFonts w:ascii="Times New Roman" w:hAnsi="Times New Roman" w:cs="Times New Roman"/>
-          <w:b/>
-          <w:bCs/>
-        </w:rPr>
-        <w:t xml:space="preserve">le </w:t>
+        <w:t xml:space="preserve">Table </w:t>
       </w:r>
       <w:r>
         <w:rPr>
@@ -944,6 +937,7 @@
           <w:bCs/>
           <w:i/>
           <w:iCs/>
+          <w:noProof/>
           <w:sz w:val="21"/>
           <w:szCs w:val="21"/>
         </w:rPr>
@@ -1081,15 +1075,13 @@
         <w:spacing w:line="480" w:lineRule="auto"/>
       </w:pPr>
       <w:r>
-        <w:t xml:space="preserve">Accordingly, </w:t>
-      </w:r>
-      <w:proofErr w:type="gramStart"/>
-      <w:r>
-        <w:t>Aim</w:t>
-      </w:r>
-      <w:proofErr w:type="gramEnd"/>
-      <w:r>
-        <w:t xml:space="preserve"> 2 power analyses were conducted at α = 0.01. Power was estimated using two-sample correlation methods (</w:t>
+        <w:t>Accordingly, Aim 2 power analyses were conducted at α = 0.</w:t>
+      </w:r>
+      <w:r>
+        <w:t>0125</w:t>
+      </w:r>
+      <w:r>
+        <w:t>. Power was estimated using two-sample correlation methods (</w:t>
       </w:r>
       <w:proofErr w:type="spellStart"/>
       <w:proofErr w:type="gramStart"/>
@@ -1108,52 +1100,11 @@
         <w:t>Results (</w:t>
       </w:r>
       <w:r>
-        <w:fldChar w:fldCharType="begin"/>
-      </w:r>
-      <w:r>
-        <w:instrText xml:space="preserve"> REF _Ref225667303 \h </w:instrText>
-      </w:r>
-      <w:r>
-        <w:instrText xml:space="preserve"> \* MERGEFORMAT </w:instrText>
-      </w:r>
-      <w:r>
-        <w:fldChar w:fldCharType="separate"/>
-      </w:r>
-      <w:r>
-        <w:rPr>
-          <w:rFonts w:ascii="Times New Roman" w:hAnsi="Times New Roman" w:cs="Times New Roman"/>
+        <w:rPr>
           <w:b/>
           <w:bCs/>
         </w:rPr>
-        <w:t>Figur</w:t>
-      </w:r>
-      <w:r>
-        <w:rPr>
-          <w:rFonts w:ascii="Times New Roman" w:hAnsi="Times New Roman" w:cs="Times New Roman"/>
-          <w:b/>
-          <w:bCs/>
-        </w:rPr>
-        <w:t>e</w:t>
-      </w:r>
-      <w:r>
-        <w:rPr>
-          <w:rFonts w:ascii="Times New Roman" w:hAnsi="Times New Roman" w:cs="Times New Roman"/>
-          <w:b/>
-          <w:bCs/>
-        </w:rPr>
-        <w:t xml:space="preserve"> </w:t>
-      </w:r>
-      <w:r>
-        <w:rPr>
-          <w:rFonts w:ascii="Times New Roman" w:hAnsi="Times New Roman" w:cs="Times New Roman"/>
-          <w:b/>
-          <w:bCs/>
-          <w:noProof/>
-        </w:rPr>
-        <w:t>1</w:t>
-      </w:r>
-      <w:r>
-        <w:fldChar w:fldCharType="end"/>
+        <w:t>Figure 1</w:t>
       </w:r>
       <w:r>
         <w:t>) indicated</w:t>
@@ -1165,11 +1116,11 @@
         <w:t xml:space="preserve">was </w:t>
       </w:r>
       <w:r>
-        <w:t xml:space="preserve">driven primarily by differences in </w:t>
+        <w:t xml:space="preserve">driven primarily by </w:t>
       </w:r>
       <w:r>
         <w:lastRenderedPageBreak/>
-        <w:t xml:space="preserve">correlations between groups rather than </w:t>
+        <w:t xml:space="preserve">differences in correlations between groups rather than </w:t>
       </w:r>
       <w:r>
         <w:t>differences in group sizes</w:t>
@@ -1187,7 +1138,13 @@
         <w:t>5</w:t>
       </w:r>
       <w:r>
-        <w:t xml:space="preserve">–0.70 were required to achieve 80% power, depending on the correlation </w:t>
+        <w:t>–0.7</w:t>
+      </w:r>
+      <w:r>
+        <w:t>5</w:t>
+      </w:r>
+      <w:r>
+        <w:t xml:space="preserve"> were required to achieve 80% power, depending on the correlation </w:t>
       </w:r>
       <w:r>
         <w:t>and size differences between the amyloid groups</w:t>
@@ -1218,13 +1175,14 @@
           <w:bCs/>
           <w:i/>
           <w:iCs/>
+          <w:noProof/>
           <w:sz w:val="21"/>
           <w:szCs w:val="21"/>
         </w:rPr>
         <w:drawing>
-          <wp:inline distT="0" distB="0" distL="0" distR="0" wp14:anchorId="6AC9FBBF" wp14:editId="23548F2B">
-            <wp:extent cx="5669435" cy="3935896"/>
-            <wp:effectExtent l="0" t="0" r="0" b="1270"/>
+          <wp:inline distT="0" distB="0" distL="0" distR="0" wp14:anchorId="6AC9FBBF" wp14:editId="110069AE">
+            <wp:extent cx="5446643" cy="3781226"/>
+            <wp:effectExtent l="0" t="0" r="1905" b="3810"/>
             <wp:docPr id="1402970270" name="Picture 1"/>
             <wp:cNvGraphicFramePr>
               <a:graphicFrameLocks xmlns:a="http://schemas.openxmlformats.org/drawingml/2006/main" noChangeAspect="1"/>
@@ -1245,7 +1203,7 @@
                   <pic:spPr>
                     <a:xfrm>
                       <a:off x="0" y="0"/>
-                      <a:ext cx="5688605" cy="3949205"/>
+                      <a:ext cx="5508341" cy="3824059"/>
                     </a:xfrm>
                     <a:prstGeom prst="rect">
                       <a:avLst/>
@@ -1353,19 +1311,7 @@
           <w:sz w:val="21"/>
           <w:szCs w:val="21"/>
         </w:rPr>
-        <w:t>. Aim 2 Power for Interaction Effects at N = 175.</w:t>
-      </w:r>
-      <w:r>
-        <w:rPr>
-          <w:rFonts w:ascii="Times New Roman" w:hAnsi="Times New Roman" w:cs="Times New Roman"/>
-          <w:b/>
-          <w:bCs/>
-          <w:i/>
-          <w:iCs/>
-          <w:sz w:val="21"/>
-          <w:szCs w:val="21"/>
-        </w:rPr>
-        <w:t xml:space="preserve"> </w:t>
+        <w:t xml:space="preserve">. Aim 2 Power for Interaction Effects at N = 175. </w:t>
       </w:r>
       <w:r>
         <w:rPr>
@@ -1458,7 +1404,6 @@
       </w:pPr>
       <w:bookmarkStart w:id="20" w:name="_Toc221022978"/>
       <w:r>
-        <w:lastRenderedPageBreak/>
         <w:t>Reproducibility Statement</w:t>
       </w:r>
       <w:bookmarkEnd w:id="20"/>
@@ -3824,6 +3769,7 @@
   <w:style w:type="character" w:default="1" w:styleId="DefaultParagraphFont">
     <w:name w:val="Default Paragraph Font"/>
     <w:uiPriority w:val="1"/>
+    <w:semiHidden/>
     <w:unhideWhenUsed/>
   </w:style>
   <w:style w:type="table" w:default="1" w:styleId="TableNormal">

</xml_diff>